<commit_message>
Laboratoire 9 : tous les documents (PDF exportés depuis LibreOffice)
</commit_message>
<xml_diff>
--- a/lab9/rapport.docx
+++ b/lab9/rapport.docx
@@ -2,6 +2,2868 @@
 <file path=word/document.xml><?xml version="1.0" encoding="utf-8"?>
 <w:document xmlns:w="http://schemas.openxmlformats.org/wordprocessingml/2006/main" xmlns:m="http://schemas.openxmlformats.org/officeDocument/2006/math" xmlns:r="http://schemas.openxmlformats.org/officeDocument/2006/relationships" xmlns:o="urn:schemas-microsoft-com:office:office" xmlns:v="urn:schemas-microsoft-com:vml" xmlns:w10="urn:schemas-microsoft-com:office:word" xmlns:a="http://schemas.openxmlformats.org/drawingml/2006/main" xmlns:pic="http://schemas.openxmlformats.org/drawingml/2006/picture" xmlns:wp="http://schemas.openxmlformats.org/drawingml/2006/wordprocessingDrawing">
   <w:body>
+    <w:p>
+      <w:pPr>
+        <w:pStyle w:val="Title"/>
+      </w:pPr>
+      <w:r>
+        <w:t xml:space="preserve">Лабораторная</w:t>
+      </w:r>
+      <w:r>
+        <w:t xml:space="preserve"> </w:t>
+      </w:r>
+      <w:r>
+        <w:t xml:space="preserve">работа</w:t>
+      </w:r>
+      <w:r>
+        <w:t xml:space="preserve"> </w:t>
+      </w:r>
+      <w:r>
+        <w:t xml:space="preserve">№9:</w:t>
+      </w:r>
+      <w:r>
+        <w:t xml:space="preserve"> </w:t>
+      </w:r>
+      <w:r>
+        <w:t xml:space="preserve">Командная</w:t>
+      </w:r>
+      <w:r>
+        <w:t xml:space="preserve"> </w:t>
+      </w:r>
+      <w:r>
+        <w:t xml:space="preserve">оболочка</w:t>
+      </w:r>
+      <w:r>
+        <w:t xml:space="preserve"> </w:t>
+      </w:r>
+      <w:r>
+        <w:t xml:space="preserve">Midnight</w:t>
+      </w:r>
+      <w:r>
+        <w:t xml:space="preserve"> </w:t>
+      </w:r>
+      <w:r>
+        <w:t xml:space="preserve">Commander</w:t>
+      </w:r>
+    </w:p>
+    <w:p>
+      <w:pPr>
+        <w:pStyle w:val="Author"/>
+      </w:pPr>
+      <w:r>
+        <w:t xml:space="preserve">Ваше</w:t>
+      </w:r>
+      <w:r>
+        <w:t xml:space="preserve"> </w:t>
+      </w:r>
+      <w:r>
+        <w:t xml:space="preserve">Имя</w:t>
+      </w:r>
+    </w:p>
+    <w:p>
+      <w:pPr>
+        <w:pStyle w:val="Date"/>
+      </w:pPr>
+    </w:p>
+    <w:bookmarkStart w:id="20" w:name="цель-работы"/>
+    <w:p>
+      <w:pPr>
+        <w:pStyle w:val="Heading1"/>
+      </w:pPr>
+      <w:r>
+        <w:t xml:space="preserve">1. Цель работы</w:t>
+      </w:r>
+    </w:p>
+    <w:p>
+      <w:pPr>
+        <w:pStyle w:val="FirstParagraph"/>
+      </w:pPr>
+      <w:r>
+        <w:t xml:space="preserve">Освоение основных возможностей командной оболочки Midnight Commander (mc). Приобретение навыков практической работы по просмотру каталогов и файлов; манипуляций с ними.</w:t>
+      </w:r>
+    </w:p>
+    <w:bookmarkEnd w:id="20"/>
+    <w:bookmarkStart w:id="21" w:name="задание"/>
+    <w:p>
+      <w:pPr>
+        <w:pStyle w:val="Heading1"/>
+      </w:pPr>
+      <w:r>
+        <w:t xml:space="preserve">2. Задание</w:t>
+      </w:r>
+    </w:p>
+    <w:p>
+      <w:pPr>
+        <w:pStyle w:val="Compact"/>
+        <w:numPr>
+          <w:ilvl w:val="0"/>
+          <w:numId w:val="1001"/>
+        </w:numPr>
+      </w:pPr>
+      <w:r>
+        <w:t xml:space="preserve">Изучить информацию о mc с помощью</w:t>
+      </w:r>
+      <w:r>
+        <w:t xml:space="preserve"> </w:t>
+      </w:r>
+      <w:r>
+        <w:rPr>
+          <w:rStyle w:val="VerbatimChar"/>
+        </w:rPr>
+        <w:t xml:space="preserve">man mc</w:t>
+      </w:r>
+      <w:r>
+        <w:t xml:space="preserve">.</w:t>
+      </w:r>
+    </w:p>
+    <w:p>
+      <w:pPr>
+        <w:pStyle w:val="Compact"/>
+        <w:numPr>
+          <w:ilvl w:val="0"/>
+          <w:numId w:val="1001"/>
+        </w:numPr>
+      </w:pPr>
+      <w:r>
+        <w:t xml:space="preserve">Запустить mc и изучить его структуру и меню.</w:t>
+      </w:r>
+    </w:p>
+    <w:p>
+      <w:pPr>
+        <w:pStyle w:val="Compact"/>
+        <w:numPr>
+          <w:ilvl w:val="0"/>
+          <w:numId w:val="1001"/>
+        </w:numPr>
+      </w:pPr>
+      <w:r>
+        <w:t xml:space="preserve">Выполнить операции с файлами и панелями.</w:t>
+      </w:r>
+    </w:p>
+    <w:p>
+      <w:pPr>
+        <w:pStyle w:val="Compact"/>
+        <w:numPr>
+          <w:ilvl w:val="0"/>
+          <w:numId w:val="1001"/>
+        </w:numPr>
+      </w:pPr>
+      <w:r>
+        <w:t xml:space="preserve">Использовать встроенный редактор mc для работы с текстом.</w:t>
+      </w:r>
+    </w:p>
+    <w:bookmarkEnd w:id="21"/>
+    <w:bookmarkStart w:id="144" w:name="выполнение-лабораторной-работы"/>
+    <w:p>
+      <w:pPr>
+        <w:pStyle w:val="Heading1"/>
+      </w:pPr>
+      <w:r>
+        <w:t xml:space="preserve">3. Выполнение лабораторной работы</w:t>
+      </w:r>
+    </w:p>
+    <w:bookmarkStart w:id="25" w:name="изучение-информации-о-mc"/>
+    <w:p>
+      <w:pPr>
+        <w:pStyle w:val="Heading2"/>
+      </w:pPr>
+      <w:r>
+        <w:t xml:space="preserve">3.1. Изучение информации о mc</w:t>
+      </w:r>
+    </w:p>
+    <w:p>
+      <w:pPr>
+        <w:pStyle w:val="FirstParagraph"/>
+      </w:pPr>
+      <w:r>
+        <w:t xml:space="preserve">Команда</w:t>
+      </w:r>
+      <w:r>
+        <w:t xml:space="preserve"> </w:t>
+      </w:r>
+      <w:r>
+        <w:rPr>
+          <w:rStyle w:val="VerbatimChar"/>
+        </w:rPr>
+        <w:t xml:space="preserve">man mc</w:t>
+      </w:r>
+      <w:r>
+        <w:t xml:space="preserve"> </w:t>
+      </w:r>
+      <w:r>
+        <w:t xml:space="preserve">выводит справочную информацию о Midnight Commander:</w:t>
+      </w:r>
+    </w:p>
+    <w:p>
+      <w:pPr>
+        <w:pStyle w:val="CaptionedFigure"/>
+      </w:pPr>
+      <w:r>
+        <w:drawing>
+          <wp:inline>
+            <wp:extent cx="3810000" cy="2540000"/>
+            <wp:effectExtent b="0" l="0" r="0" t="0"/>
+            <wp:docPr descr="man mc" title="" id="23" name="Picture"/>
+            <a:graphic>
+              <a:graphicData uri="http://schemas.openxmlformats.org/drawingml/2006/picture">
+                <pic:pic>
+                  <pic:nvPicPr>
+                    <pic:cNvPr descr="images/man_mc.png" id="24" name="Picture"/>
+                    <pic:cNvPicPr>
+                      <a:picLocks noChangeArrowheads="1" noChangeAspect="1"/>
+                    </pic:cNvPicPr>
+                  </pic:nvPicPr>
+                  <pic:blipFill>
+                    <a:blip r:embed="rId22"/>
+                    <a:stretch>
+                      <a:fillRect/>
+                    </a:stretch>
+                  </pic:blipFill>
+                  <pic:spPr bwMode="auto">
+                    <a:xfrm>
+                      <a:off x="0" y="0"/>
+                      <a:ext cx="3810000" cy="2540000"/>
+                    </a:xfrm>
+                    <a:prstGeom prst="rect">
+                      <a:avLst/>
+                    </a:prstGeom>
+                    <a:noFill/>
+                    <a:ln w="9525">
+                      <a:noFill/>
+                      <a:headEnd/>
+                      <a:tailEnd/>
+                    </a:ln>
+                  </pic:spPr>
+                </pic:pic>
+              </a:graphicData>
+            </a:graphic>
+          </wp:inline>
+        </w:drawing>
+      </w:r>
+    </w:p>
+    <w:p>
+      <w:pPr>
+        <w:pStyle w:val="ImageCaption"/>
+      </w:pPr>
+      <w:r>
+        <w:t xml:space="preserve">man mc</w:t>
+      </w:r>
+    </w:p>
+    <w:bookmarkEnd w:id="25"/>
+    <w:bookmarkStart w:id="32" w:name="запуск-и-общий-вид-midnight-commander"/>
+    <w:p>
+      <w:pPr>
+        <w:pStyle w:val="Heading2"/>
+      </w:pPr>
+      <w:r>
+        <w:t xml:space="preserve">3.2. Запуск и общий вид Midnight Commander</w:t>
+      </w:r>
+    </w:p>
+    <w:p>
+      <w:pPr>
+        <w:pStyle w:val="FirstParagraph"/>
+      </w:pPr>
+      <w:r>
+        <w:t xml:space="preserve">Запуск mc осуществляется командой</w:t>
+      </w:r>
+      <w:r>
+        <w:t xml:space="preserve"> </w:t>
+      </w:r>
+      <w:r>
+        <w:rPr>
+          <w:rStyle w:val="VerbatimChar"/>
+        </w:rPr>
+        <w:t xml:space="preserve">mc</w:t>
+      </w:r>
+      <w:r>
+        <w:t xml:space="preserve"> </w:t>
+      </w:r>
+      <w:r>
+        <w:t xml:space="preserve">в терминале:</w:t>
+      </w:r>
+    </w:p>
+    <w:p>
+      <w:pPr>
+        <w:pStyle w:val="CaptionedFigure"/>
+      </w:pPr>
+      <w:r>
+        <w:drawing>
+          <wp:inline>
+            <wp:extent cx="3810000" cy="2540000"/>
+            <wp:effectExtent b="0" l="0" r="0" t="0"/>
+            <wp:docPr descr="Запуск mc" title="" id="27" name="Picture"/>
+            <a:graphic>
+              <a:graphicData uri="http://schemas.openxmlformats.org/drawingml/2006/picture">
+                <pic:pic>
+                  <pic:nvPicPr>
+                    <pic:cNvPr descr="images/mc_launch.png" id="28" name="Picture"/>
+                    <pic:cNvPicPr>
+                      <a:picLocks noChangeArrowheads="1" noChangeAspect="1"/>
+                    </pic:cNvPicPr>
+                  </pic:nvPicPr>
+                  <pic:blipFill>
+                    <a:blip r:embed="rId26"/>
+                    <a:stretch>
+                      <a:fillRect/>
+                    </a:stretch>
+                  </pic:blipFill>
+                  <pic:spPr bwMode="auto">
+                    <a:xfrm>
+                      <a:off x="0" y="0"/>
+                      <a:ext cx="3810000" cy="2540000"/>
+                    </a:xfrm>
+                    <a:prstGeom prst="rect">
+                      <a:avLst/>
+                    </a:prstGeom>
+                    <a:noFill/>
+                    <a:ln w="9525">
+                      <a:noFill/>
+                      <a:headEnd/>
+                      <a:tailEnd/>
+                    </a:ln>
+                  </pic:spPr>
+                </pic:pic>
+              </a:graphicData>
+            </a:graphic>
+          </wp:inline>
+        </w:drawing>
+      </w:r>
+    </w:p>
+    <w:p>
+      <w:pPr>
+        <w:pStyle w:val="ImageCaption"/>
+      </w:pPr>
+      <w:r>
+        <w:t xml:space="preserve">Запуск mc</w:t>
+      </w:r>
+    </w:p>
+    <w:p>
+      <w:pPr>
+        <w:pStyle w:val="BodyText"/>
+      </w:pPr>
+      <w:r>
+        <w:t xml:space="preserve">Основное окно mc содержит две панели, отображающие списки файлов:</w:t>
+      </w:r>
+    </w:p>
+    <w:p>
+      <w:pPr>
+        <w:pStyle w:val="CaptionedFigure"/>
+      </w:pPr>
+      <w:r>
+        <w:drawing>
+          <wp:inline>
+            <wp:extent cx="3810000" cy="2540000"/>
+            <wp:effectExtent b="0" l="0" r="0" t="0"/>
+            <wp:docPr descr="Главное окно mc" title="" id="30" name="Picture"/>
+            <a:graphic>
+              <a:graphicData uri="http://schemas.openxmlformats.org/drawingml/2006/picture">
+                <pic:pic>
+                  <pic:nvPicPr>
+                    <pic:cNvPr descr="images/mc_main.png" id="31" name="Picture"/>
+                    <pic:cNvPicPr>
+                      <a:picLocks noChangeArrowheads="1" noChangeAspect="1"/>
+                    </pic:cNvPicPr>
+                  </pic:nvPicPr>
+                  <pic:blipFill>
+                    <a:blip r:embed="rId29"/>
+                    <a:stretch>
+                      <a:fillRect/>
+                    </a:stretch>
+                  </pic:blipFill>
+                  <pic:spPr bwMode="auto">
+                    <a:xfrm>
+                      <a:off x="0" y="0"/>
+                      <a:ext cx="3810000" cy="2540000"/>
+                    </a:xfrm>
+                    <a:prstGeom prst="rect">
+                      <a:avLst/>
+                    </a:prstGeom>
+                    <a:noFill/>
+                    <a:ln w="9525">
+                      <a:noFill/>
+                      <a:headEnd/>
+                      <a:tailEnd/>
+                    </a:ln>
+                  </pic:spPr>
+                </pic:pic>
+              </a:graphicData>
+            </a:graphic>
+          </wp:inline>
+        </w:drawing>
+      </w:r>
+    </w:p>
+    <w:p>
+      <w:pPr>
+        <w:pStyle w:val="ImageCaption"/>
+      </w:pPr>
+      <w:r>
+        <w:t xml:space="preserve">Главное окно mc</w:t>
+      </w:r>
+    </w:p>
+    <w:bookmarkEnd w:id="32"/>
+    <w:bookmarkStart w:id="57" w:name="управление-панелями"/>
+    <w:p>
+      <w:pPr>
+        <w:pStyle w:val="Heading2"/>
+      </w:pPr>
+      <w:r>
+        <w:t xml:space="preserve">3.3. Управление панелями</w:t>
+      </w:r>
+    </w:p>
+    <w:bookmarkStart w:id="39" w:name="меню-панелей"/>
+    <w:p>
+      <w:pPr>
+        <w:pStyle w:val="Heading3"/>
+      </w:pPr>
+      <w:r>
+        <w:t xml:space="preserve">3.3.1. Меню панелей</w:t>
+      </w:r>
+    </w:p>
+    <w:p>
+      <w:pPr>
+        <w:pStyle w:val="FirstParagraph"/>
+      </w:pPr>
+      <w:r>
+        <w:t xml:space="preserve">Меню</w:t>
+      </w:r>
+      <w:r>
+        <w:t xml:space="preserve"> </w:t>
+      </w:r>
+      <w:r>
+        <w:t xml:space="preserve">“</w:t>
+      </w:r>
+      <w:r>
+        <w:t xml:space="preserve">Left panel</w:t>
+      </w:r>
+      <w:r>
+        <w:t xml:space="preserve">”</w:t>
+      </w:r>
+      <w:r>
+        <w:t xml:space="preserve"> </w:t>
+      </w:r>
+      <w:r>
+        <w:t xml:space="preserve">(F9 → Left) и</w:t>
+      </w:r>
+      <w:r>
+        <w:t xml:space="preserve"> </w:t>
+      </w:r>
+      <w:r>
+        <w:t xml:space="preserve">“</w:t>
+      </w:r>
+      <w:r>
+        <w:t xml:space="preserve">Right panel</w:t>
+      </w:r>
+      <w:r>
+        <w:t xml:space="preserve">”</w:t>
+      </w:r>
+      <w:r>
+        <w:t xml:space="preserve"> </w:t>
+      </w:r>
+      <w:r>
+        <w:t xml:space="preserve">(F9 → Right) позволяют настраивать отображение панелей:</w:t>
+      </w:r>
+    </w:p>
+    <w:p>
+      <w:pPr>
+        <w:pStyle w:val="CaptionedFigure"/>
+      </w:pPr>
+      <w:r>
+        <w:drawing>
+          <wp:inline>
+            <wp:extent cx="3810000" cy="2540000"/>
+            <wp:effectExtent b="0" l="0" r="0" t="0"/>
+            <wp:docPr descr="Меню левой панели" title="" id="34" name="Picture"/>
+            <a:graphic>
+              <a:graphicData uri="http://schemas.openxmlformats.org/drawingml/2006/picture">
+                <pic:pic>
+                  <pic:nvPicPr>
+                    <pic:cNvPr descr="images/mc_left_panel_menu.png" id="35" name="Picture"/>
+                    <pic:cNvPicPr>
+                      <a:picLocks noChangeArrowheads="1" noChangeAspect="1"/>
+                    </pic:cNvPicPr>
+                  </pic:nvPicPr>
+                  <pic:blipFill>
+                    <a:blip r:embed="rId33"/>
+                    <a:stretch>
+                      <a:fillRect/>
+                    </a:stretch>
+                  </pic:blipFill>
+                  <pic:spPr bwMode="auto">
+                    <a:xfrm>
+                      <a:off x="0" y="0"/>
+                      <a:ext cx="3810000" cy="2540000"/>
+                    </a:xfrm>
+                    <a:prstGeom prst="rect">
+                      <a:avLst/>
+                    </a:prstGeom>
+                    <a:noFill/>
+                    <a:ln w="9525">
+                      <a:noFill/>
+                      <a:headEnd/>
+                      <a:tailEnd/>
+                    </a:ln>
+                  </pic:spPr>
+                </pic:pic>
+              </a:graphicData>
+            </a:graphic>
+          </wp:inline>
+        </w:drawing>
+      </w:r>
+    </w:p>
+    <w:p>
+      <w:pPr>
+        <w:pStyle w:val="ImageCaption"/>
+      </w:pPr>
+      <w:r>
+        <w:t xml:space="preserve">Меню левой панели</w:t>
+      </w:r>
+    </w:p>
+    <w:p>
+      <w:pPr>
+        <w:pStyle w:val="CaptionedFigure"/>
+      </w:pPr>
+      <w:r>
+        <w:drawing>
+          <wp:inline>
+            <wp:extent cx="3810000" cy="2540000"/>
+            <wp:effectExtent b="0" l="0" r="0" t="0"/>
+            <wp:docPr descr="Меню правой панели" title="" id="37" name="Picture"/>
+            <a:graphic>
+              <a:graphicData uri="http://schemas.openxmlformats.org/drawingml/2006/picture">
+                <pic:pic>
+                  <pic:nvPicPr>
+                    <pic:cNvPr descr="images/mc_right_panel_menu.png" id="38" name="Picture"/>
+                    <pic:cNvPicPr>
+                      <a:picLocks noChangeArrowheads="1" noChangeAspect="1"/>
+                    </pic:cNvPicPr>
+                  </pic:nvPicPr>
+                  <pic:blipFill>
+                    <a:blip r:embed="rId36"/>
+                    <a:stretch>
+                      <a:fillRect/>
+                    </a:stretch>
+                  </pic:blipFill>
+                  <pic:spPr bwMode="auto">
+                    <a:xfrm>
+                      <a:off x="0" y="0"/>
+                      <a:ext cx="3810000" cy="2540000"/>
+                    </a:xfrm>
+                    <a:prstGeom prst="rect">
+                      <a:avLst/>
+                    </a:prstGeom>
+                    <a:noFill/>
+                    <a:ln w="9525">
+                      <a:noFill/>
+                      <a:headEnd/>
+                      <a:tailEnd/>
+                    </a:ln>
+                  </pic:spPr>
+                </pic:pic>
+              </a:graphicData>
+            </a:graphic>
+          </wp:inline>
+        </w:drawing>
+      </w:r>
+    </w:p>
+    <w:p>
+      <w:pPr>
+        <w:pStyle w:val="ImageCaption"/>
+      </w:pPr>
+      <w:r>
+        <w:t xml:space="preserve">Меню правой панели</w:t>
+      </w:r>
+    </w:p>
+    <w:bookmarkEnd w:id="39"/>
+    <w:bookmarkStart w:id="46" w:name="режимы-отображения-панелей"/>
+    <w:p>
+      <w:pPr>
+        <w:pStyle w:val="Heading3"/>
+      </w:pPr>
+      <w:r>
+        <w:t xml:space="preserve">3.3.2. Режимы отображения панелей</w:t>
+      </w:r>
+    </w:p>
+    <w:p>
+      <w:pPr>
+        <w:pStyle w:val="FirstParagraph"/>
+      </w:pPr>
+      <w:r>
+        <w:rPr>
+          <w:b/>
+          <w:bCs/>
+        </w:rPr>
+        <w:t xml:space="preserve">Режим Info</w:t>
+      </w:r>
+      <w:r>
+        <w:t xml:space="preserve"> </w:t>
+      </w:r>
+      <w:r>
+        <w:t xml:space="preserve">(Информация) — отображает сведения о файле и файловой системе:</w:t>
+      </w:r>
+    </w:p>
+    <w:p>
+      <w:pPr>
+        <w:pStyle w:val="CaptionedFigure"/>
+      </w:pPr>
+      <w:r>
+        <w:drawing>
+          <wp:inline>
+            <wp:extent cx="3810000" cy="2540000"/>
+            <wp:effectExtent b="0" l="0" r="0" t="0"/>
+            <wp:docPr descr="Режим Info" title="" id="41" name="Picture"/>
+            <a:graphic>
+              <a:graphicData uri="http://schemas.openxmlformats.org/drawingml/2006/picture">
+                <pic:pic>
+                  <pic:nvPicPr>
+                    <pic:cNvPr descr="images/mc_info_mode.png" id="42" name="Picture"/>
+                    <pic:cNvPicPr>
+                      <a:picLocks noChangeArrowheads="1" noChangeAspect="1"/>
+                    </pic:cNvPicPr>
+                  </pic:nvPicPr>
+                  <pic:blipFill>
+                    <a:blip r:embed="rId40"/>
+                    <a:stretch>
+                      <a:fillRect/>
+                    </a:stretch>
+                  </pic:blipFill>
+                  <pic:spPr bwMode="auto">
+                    <a:xfrm>
+                      <a:off x="0" y="0"/>
+                      <a:ext cx="3810000" cy="2540000"/>
+                    </a:xfrm>
+                    <a:prstGeom prst="rect">
+                      <a:avLst/>
+                    </a:prstGeom>
+                    <a:noFill/>
+                    <a:ln w="9525">
+                      <a:noFill/>
+                      <a:headEnd/>
+                      <a:tailEnd/>
+                    </a:ln>
+                  </pic:spPr>
+                </pic:pic>
+              </a:graphicData>
+            </a:graphic>
+          </wp:inline>
+        </w:drawing>
+      </w:r>
+    </w:p>
+    <w:p>
+      <w:pPr>
+        <w:pStyle w:val="ImageCaption"/>
+      </w:pPr>
+      <w:r>
+        <w:t xml:space="preserve">Режим Info</w:t>
+      </w:r>
+    </w:p>
+    <w:p>
+      <w:pPr>
+        <w:pStyle w:val="BodyText"/>
+      </w:pPr>
+      <w:r>
+        <w:rPr>
+          <w:b/>
+          <w:bCs/>
+        </w:rPr>
+        <w:t xml:space="preserve">Режим Tree</w:t>
+      </w:r>
+      <w:r>
+        <w:t xml:space="preserve"> </w:t>
+      </w:r>
+      <w:r>
+        <w:t xml:space="preserve">(Дерево) — отображает структуру дерева каталогов:</w:t>
+      </w:r>
+    </w:p>
+    <w:p>
+      <w:pPr>
+        <w:pStyle w:val="CaptionedFigure"/>
+      </w:pPr>
+      <w:r>
+        <w:drawing>
+          <wp:inline>
+            <wp:extent cx="3810000" cy="2540000"/>
+            <wp:effectExtent b="0" l="0" r="0" t="0"/>
+            <wp:docPr descr="Режим Tree" title="" id="44" name="Picture"/>
+            <a:graphic>
+              <a:graphicData uri="http://schemas.openxmlformats.org/drawingml/2006/picture">
+                <pic:pic>
+                  <pic:nvPicPr>
+                    <pic:cNvPr descr="images/mc_tree_mode.png" id="45" name="Picture"/>
+                    <pic:cNvPicPr>
+                      <a:picLocks noChangeArrowheads="1" noChangeAspect="1"/>
+                    </pic:cNvPicPr>
+                  </pic:nvPicPr>
+                  <pic:blipFill>
+                    <a:blip r:embed="rId43"/>
+                    <a:stretch>
+                      <a:fillRect/>
+                    </a:stretch>
+                  </pic:blipFill>
+                  <pic:spPr bwMode="auto">
+                    <a:xfrm>
+                      <a:off x="0" y="0"/>
+                      <a:ext cx="3810000" cy="2540000"/>
+                    </a:xfrm>
+                    <a:prstGeom prst="rect">
+                      <a:avLst/>
+                    </a:prstGeom>
+                    <a:noFill/>
+                    <a:ln w="9525">
+                      <a:noFill/>
+                      <a:headEnd/>
+                      <a:tailEnd/>
+                    </a:ln>
+                  </pic:spPr>
+                </pic:pic>
+              </a:graphicData>
+            </a:graphic>
+          </wp:inline>
+        </w:drawing>
+      </w:r>
+    </w:p>
+    <w:p>
+      <w:pPr>
+        <w:pStyle w:val="ImageCaption"/>
+      </w:pPr>
+      <w:r>
+        <w:t xml:space="preserve">Режим Tree</w:t>
+      </w:r>
+    </w:p>
+    <w:bookmarkEnd w:id="46"/>
+    <w:bookmarkStart w:id="56" w:name="операции-с-панелями"/>
+    <w:p>
+      <w:pPr>
+        <w:pStyle w:val="Heading3"/>
+      </w:pPr>
+      <w:r>
+        <w:t xml:space="preserve">3.3.3. Операции с панелями</w:t>
+      </w:r>
+    </w:p>
+    <w:p>
+      <w:pPr>
+        <w:pStyle w:val="FirstParagraph"/>
+      </w:pPr>
+      <w:r>
+        <w:rPr>
+          <w:b/>
+          <w:bCs/>
+        </w:rPr>
+        <w:t xml:space="preserve">Перестановка панелей</w:t>
+      </w:r>
+      <w:r>
+        <w:t xml:space="preserve"> </w:t>
+      </w:r>
+      <w:r>
+        <w:t xml:space="preserve">(</w:t>
+      </w:r>
+      <w:r>
+        <w:rPr>
+          <w:rStyle w:val="VerbatimChar"/>
+        </w:rPr>
+        <w:t xml:space="preserve">Ctrl+u</w:t>
+      </w:r>
+      <w:r>
+        <w:t xml:space="preserve">) меняет местами левую и правую панели:</w:t>
+      </w:r>
+    </w:p>
+    <w:p>
+      <w:pPr>
+        <w:pStyle w:val="CaptionedFigure"/>
+      </w:pPr>
+      <w:r>
+        <w:drawing>
+          <wp:inline>
+            <wp:extent cx="3810000" cy="2540000"/>
+            <wp:effectExtent b="0" l="0" r="0" t="0"/>
+            <wp:docPr descr="Перестановка панелей" title="" id="48" name="Picture"/>
+            <a:graphic>
+              <a:graphicData uri="http://schemas.openxmlformats.org/drawingml/2006/picture">
+                <pic:pic>
+                  <pic:nvPicPr>
+                    <pic:cNvPr descr="images/mc_swap_panels.png" id="49" name="Picture"/>
+                    <pic:cNvPicPr>
+                      <a:picLocks noChangeArrowheads="1" noChangeAspect="1"/>
+                    </pic:cNvPicPr>
+                  </pic:nvPicPr>
+                  <pic:blipFill>
+                    <a:blip r:embed="rId47"/>
+                    <a:stretch>
+                      <a:fillRect/>
+                    </a:stretch>
+                  </pic:blipFill>
+                  <pic:spPr bwMode="auto">
+                    <a:xfrm>
+                      <a:off x="0" y="0"/>
+                      <a:ext cx="3810000" cy="2540000"/>
+                    </a:xfrm>
+                    <a:prstGeom prst="rect">
+                      <a:avLst/>
+                    </a:prstGeom>
+                    <a:noFill/>
+                    <a:ln w="9525">
+                      <a:noFill/>
+                      <a:headEnd/>
+                      <a:tailEnd/>
+                    </a:ln>
+                  </pic:spPr>
+                </pic:pic>
+              </a:graphicData>
+            </a:graphic>
+          </wp:inline>
+        </w:drawing>
+      </w:r>
+    </w:p>
+    <w:p>
+      <w:pPr>
+        <w:pStyle w:val="ImageCaption"/>
+      </w:pPr>
+      <w:r>
+        <w:t xml:space="preserve">Перестановка панелей</w:t>
+      </w:r>
+    </w:p>
+    <w:p>
+      <w:pPr>
+        <w:pStyle w:val="BodyText"/>
+      </w:pPr>
+      <w:r>
+        <w:rPr>
+          <w:b/>
+          <w:bCs/>
+        </w:rPr>
+        <w:t xml:space="preserve">Отключение панелей</w:t>
+      </w:r>
+      <w:r>
+        <w:t xml:space="preserve"> </w:t>
+      </w:r>
+      <w:r>
+        <w:t xml:space="preserve">(</w:t>
+      </w:r>
+      <w:r>
+        <w:rPr>
+          <w:rStyle w:val="VerbatimChar"/>
+        </w:rPr>
+        <w:t xml:space="preserve">Ctrl+o</w:t>
+      </w:r>
+      <w:r>
+        <w:t xml:space="preserve">) временно скрывает панели для просмотра вывода команд:</w:t>
+      </w:r>
+    </w:p>
+    <w:p>
+      <w:pPr>
+        <w:pStyle w:val="CaptionedFigure"/>
+      </w:pPr>
+      <w:r>
+        <w:drawing>
+          <wp:inline>
+            <wp:extent cx="3810000" cy="2540000"/>
+            <wp:effectExtent b="0" l="0" r="0" t="0"/>
+            <wp:docPr descr="Отключение панелей" title="" id="51" name="Picture"/>
+            <a:graphic>
+              <a:graphicData uri="http://schemas.openxmlformats.org/drawingml/2006/picture">
+                <pic:pic>
+                  <pic:nvPicPr>
+                    <pic:cNvPr descr="images/mc_disable_panels.png" id="52" name="Picture"/>
+                    <pic:cNvPicPr>
+                      <a:picLocks noChangeArrowheads="1" noChangeAspect="1"/>
+                    </pic:cNvPicPr>
+                  </pic:nvPicPr>
+                  <pic:blipFill>
+                    <a:blip r:embed="rId50"/>
+                    <a:stretch>
+                      <a:fillRect/>
+                    </a:stretch>
+                  </pic:blipFill>
+                  <pic:spPr bwMode="auto">
+                    <a:xfrm>
+                      <a:off x="0" y="0"/>
+                      <a:ext cx="3810000" cy="2540000"/>
+                    </a:xfrm>
+                    <a:prstGeom prst="rect">
+                      <a:avLst/>
+                    </a:prstGeom>
+                    <a:noFill/>
+                    <a:ln w="9525">
+                      <a:noFill/>
+                      <a:headEnd/>
+                      <a:tailEnd/>
+                    </a:ln>
+                  </pic:spPr>
+                </pic:pic>
+              </a:graphicData>
+            </a:graphic>
+          </wp:inline>
+        </w:drawing>
+      </w:r>
+    </w:p>
+    <w:p>
+      <w:pPr>
+        <w:pStyle w:val="ImageCaption"/>
+      </w:pPr>
+      <w:r>
+        <w:t xml:space="preserve">Отключение панелей</w:t>
+      </w:r>
+    </w:p>
+    <w:p>
+      <w:pPr>
+        <w:pStyle w:val="BodyText"/>
+      </w:pPr>
+      <w:r>
+        <w:rPr>
+          <w:b/>
+          <w:bCs/>
+        </w:rPr>
+        <w:t xml:space="preserve">Сравнение каталогов</w:t>
+      </w:r>
+      <w:r>
+        <w:t xml:space="preserve"> </w:t>
+      </w:r>
+      <w:r>
+        <w:t xml:space="preserve">(</w:t>
+      </w:r>
+      <w:r>
+        <w:rPr>
+          <w:rStyle w:val="VerbatimChar"/>
+        </w:rPr>
+        <w:t xml:space="preserve">Ctrl+x d</w:t>
+      </w:r>
+      <w:r>
+        <w:t xml:space="preserve">) сравнивает содержимое двух панелей:</w:t>
+      </w:r>
+    </w:p>
+    <w:p>
+      <w:pPr>
+        <w:pStyle w:val="CaptionedFigure"/>
+      </w:pPr>
+      <w:r>
+        <w:drawing>
+          <wp:inline>
+            <wp:extent cx="3810000" cy="2540000"/>
+            <wp:effectExtent b="0" l="0" r="0" t="0"/>
+            <wp:docPr descr="Сравнение каталогов" title="" id="54" name="Picture"/>
+            <a:graphic>
+              <a:graphicData uri="http://schemas.openxmlformats.org/drawingml/2006/picture">
+                <pic:pic>
+                  <pic:nvPicPr>
+                    <pic:cNvPr descr="images/mc_compare_dirs.png" id="55" name="Picture"/>
+                    <pic:cNvPicPr>
+                      <a:picLocks noChangeArrowheads="1" noChangeAspect="1"/>
+                    </pic:cNvPicPr>
+                  </pic:nvPicPr>
+                  <pic:blipFill>
+                    <a:blip r:embed="rId53"/>
+                    <a:stretch>
+                      <a:fillRect/>
+                    </a:stretch>
+                  </pic:blipFill>
+                  <pic:spPr bwMode="auto">
+                    <a:xfrm>
+                      <a:off x="0" y="0"/>
+                      <a:ext cx="3810000" cy="2540000"/>
+                    </a:xfrm>
+                    <a:prstGeom prst="rect">
+                      <a:avLst/>
+                    </a:prstGeom>
+                    <a:noFill/>
+                    <a:ln w="9525">
+                      <a:noFill/>
+                      <a:headEnd/>
+                      <a:tailEnd/>
+                    </a:ln>
+                  </pic:spPr>
+                </pic:pic>
+              </a:graphicData>
+            </a:graphic>
+          </wp:inline>
+        </w:drawing>
+      </w:r>
+    </w:p>
+    <w:p>
+      <w:pPr>
+        <w:pStyle w:val="ImageCaption"/>
+      </w:pPr>
+      <w:r>
+        <w:t xml:space="preserve">Сравнение каталогов</w:t>
+      </w:r>
+    </w:p>
+    <w:bookmarkEnd w:id="56"/>
+    <w:bookmarkEnd w:id="57"/>
+    <w:bookmarkStart w:id="89" w:name="меню-file-файл"/>
+    <w:p>
+      <w:pPr>
+        <w:pStyle w:val="Heading2"/>
+      </w:pPr>
+      <w:r>
+        <w:t xml:space="preserve">3.4. Меню File (Файл)</w:t>
+      </w:r>
+    </w:p>
+    <w:p>
+      <w:pPr>
+        <w:pStyle w:val="FirstParagraph"/>
+      </w:pPr>
+      <w:r>
+        <w:t xml:space="preserve">Меню File содержит основные операции с файлами:</w:t>
+      </w:r>
+    </w:p>
+    <w:p>
+      <w:pPr>
+        <w:pStyle w:val="CaptionedFigure"/>
+      </w:pPr>
+      <w:r>
+        <w:drawing>
+          <wp:inline>
+            <wp:extent cx="3810000" cy="2540000"/>
+            <wp:effectExtent b="0" l="0" r="0" t="0"/>
+            <wp:docPr descr="Меню File" title="" id="59" name="Picture"/>
+            <a:graphic>
+              <a:graphicData uri="http://schemas.openxmlformats.org/drawingml/2006/picture">
+                <pic:pic>
+                  <pic:nvPicPr>
+                    <pic:cNvPr descr="images/mc_file_menu.png" id="60" name="Picture"/>
+                    <pic:cNvPicPr>
+                      <a:picLocks noChangeArrowheads="1" noChangeAspect="1"/>
+                    </pic:cNvPicPr>
+                  </pic:nvPicPr>
+                  <pic:blipFill>
+                    <a:blip r:embed="rId58"/>
+                    <a:stretch>
+                      <a:fillRect/>
+                    </a:stretch>
+                  </pic:blipFill>
+                  <pic:spPr bwMode="auto">
+                    <a:xfrm>
+                      <a:off x="0" y="0"/>
+                      <a:ext cx="3810000" cy="2540000"/>
+                    </a:xfrm>
+                    <a:prstGeom prst="rect">
+                      <a:avLst/>
+                    </a:prstGeom>
+                    <a:noFill/>
+                    <a:ln w="9525">
+                      <a:noFill/>
+                      <a:headEnd/>
+                      <a:tailEnd/>
+                    </a:ln>
+                  </pic:spPr>
+                </pic:pic>
+              </a:graphicData>
+            </a:graphic>
+          </wp:inline>
+        </w:drawing>
+      </w:r>
+    </w:p>
+    <w:p>
+      <w:pPr>
+        <w:pStyle w:val="ImageCaption"/>
+      </w:pPr>
+      <w:r>
+        <w:t xml:space="preserve">Меню File</w:t>
+      </w:r>
+    </w:p>
+    <w:bookmarkStart w:id="64" w:name="создание-каталога-f7"/>
+    <w:p>
+      <w:pPr>
+        <w:pStyle w:val="Heading3"/>
+      </w:pPr>
+      <w:r>
+        <w:t xml:space="preserve">3.4.1. Создание каталога (F7)</w:t>
+      </w:r>
+    </w:p>
+    <w:p>
+      <w:pPr>
+        <w:pStyle w:val="CaptionedFigure"/>
+      </w:pPr>
+      <w:r>
+        <w:drawing>
+          <wp:inline>
+            <wp:extent cx="3810000" cy="2540000"/>
+            <wp:effectExtent b="0" l="0" r="0" t="0"/>
+            <wp:docPr descr="Создание каталога" title="" id="62" name="Picture"/>
+            <a:graphic>
+              <a:graphicData uri="http://schemas.openxmlformats.org/drawingml/2006/picture">
+                <pic:pic>
+                  <pic:nvPicPr>
+                    <pic:cNvPr descr="images/mc_mkdir.png" id="63" name="Picture"/>
+                    <pic:cNvPicPr>
+                      <a:picLocks noChangeArrowheads="1" noChangeAspect="1"/>
+                    </pic:cNvPicPr>
+                  </pic:nvPicPr>
+                  <pic:blipFill>
+                    <a:blip r:embed="rId61"/>
+                    <a:stretch>
+                      <a:fillRect/>
+                    </a:stretch>
+                  </pic:blipFill>
+                  <pic:spPr bwMode="auto">
+                    <a:xfrm>
+                      <a:off x="0" y="0"/>
+                      <a:ext cx="3810000" cy="2540000"/>
+                    </a:xfrm>
+                    <a:prstGeom prst="rect">
+                      <a:avLst/>
+                    </a:prstGeom>
+                    <a:noFill/>
+                    <a:ln w="9525">
+                      <a:noFill/>
+                      <a:headEnd/>
+                      <a:tailEnd/>
+                    </a:ln>
+                  </pic:spPr>
+                </pic:pic>
+              </a:graphicData>
+            </a:graphic>
+          </wp:inline>
+        </w:drawing>
+      </w:r>
+    </w:p>
+    <w:p>
+      <w:pPr>
+        <w:pStyle w:val="ImageCaption"/>
+      </w:pPr>
+      <w:r>
+        <w:t xml:space="preserve">Создание каталога</w:t>
+      </w:r>
+    </w:p>
+    <w:bookmarkEnd w:id="64"/>
+    <w:bookmarkStart w:id="68" w:name="копирование-файла-f5"/>
+    <w:p>
+      <w:pPr>
+        <w:pStyle w:val="Heading3"/>
+      </w:pPr>
+      <w:r>
+        <w:t xml:space="preserve">3.4.2. Копирование файла (F5)</w:t>
+      </w:r>
+    </w:p>
+    <w:p>
+      <w:pPr>
+        <w:pStyle w:val="CaptionedFigure"/>
+      </w:pPr>
+      <w:r>
+        <w:drawing>
+          <wp:inline>
+            <wp:extent cx="3810000" cy="2540000"/>
+            <wp:effectExtent b="0" l="0" r="0" t="0"/>
+            <wp:docPr descr="Копирование файла" title="" id="66" name="Picture"/>
+            <a:graphic>
+              <a:graphicData uri="http://schemas.openxmlformats.org/drawingml/2006/picture">
+                <pic:pic>
+                  <pic:nvPicPr>
+                    <pic:cNvPr descr="images/mc_copy.png" id="67" name="Picture"/>
+                    <pic:cNvPicPr>
+                      <a:picLocks noChangeArrowheads="1" noChangeAspect="1"/>
+                    </pic:cNvPicPr>
+                  </pic:nvPicPr>
+                  <pic:blipFill>
+                    <a:blip r:embed="rId65"/>
+                    <a:stretch>
+                      <a:fillRect/>
+                    </a:stretch>
+                  </pic:blipFill>
+                  <pic:spPr bwMode="auto">
+                    <a:xfrm>
+                      <a:off x="0" y="0"/>
+                      <a:ext cx="3810000" cy="2540000"/>
+                    </a:xfrm>
+                    <a:prstGeom prst="rect">
+                      <a:avLst/>
+                    </a:prstGeom>
+                    <a:noFill/>
+                    <a:ln w="9525">
+                      <a:noFill/>
+                      <a:headEnd/>
+                      <a:tailEnd/>
+                    </a:ln>
+                  </pic:spPr>
+                </pic:pic>
+              </a:graphicData>
+            </a:graphic>
+          </wp:inline>
+        </w:drawing>
+      </w:r>
+    </w:p>
+    <w:p>
+      <w:pPr>
+        <w:pStyle w:val="ImageCaption"/>
+      </w:pPr>
+      <w:r>
+        <w:t xml:space="preserve">Копирование файла</w:t>
+      </w:r>
+    </w:p>
+    <w:bookmarkEnd w:id="68"/>
+    <w:bookmarkStart w:id="72" w:name="перемещениепереименование-f6"/>
+    <w:p>
+      <w:pPr>
+        <w:pStyle w:val="Heading3"/>
+      </w:pPr>
+      <w:r>
+        <w:t xml:space="preserve">3.4.3. Перемещение/переименование (F6)</w:t>
+      </w:r>
+    </w:p>
+    <w:p>
+      <w:pPr>
+        <w:pStyle w:val="CaptionedFigure"/>
+      </w:pPr>
+      <w:r>
+        <w:drawing>
+          <wp:inline>
+            <wp:extent cx="3810000" cy="2540000"/>
+            <wp:effectExtent b="0" l="0" r="0" t="0"/>
+            <wp:docPr descr="Перемещение файла" title="" id="70" name="Picture"/>
+            <a:graphic>
+              <a:graphicData uri="http://schemas.openxmlformats.org/drawingml/2006/picture">
+                <pic:pic>
+                  <pic:nvPicPr>
+                    <pic:cNvPr descr="images/mc_move.png" id="71" name="Picture"/>
+                    <pic:cNvPicPr>
+                      <a:picLocks noChangeArrowheads="1" noChangeAspect="1"/>
+                    </pic:cNvPicPr>
+                  </pic:nvPicPr>
+                  <pic:blipFill>
+                    <a:blip r:embed="rId69"/>
+                    <a:stretch>
+                      <a:fillRect/>
+                    </a:stretch>
+                  </pic:blipFill>
+                  <pic:spPr bwMode="auto">
+                    <a:xfrm>
+                      <a:off x="0" y="0"/>
+                      <a:ext cx="3810000" cy="2540000"/>
+                    </a:xfrm>
+                    <a:prstGeom prst="rect">
+                      <a:avLst/>
+                    </a:prstGeom>
+                    <a:noFill/>
+                    <a:ln w="9525">
+                      <a:noFill/>
+                      <a:headEnd/>
+                      <a:tailEnd/>
+                    </a:ln>
+                  </pic:spPr>
+                </pic:pic>
+              </a:graphicData>
+            </a:graphic>
+          </wp:inline>
+        </w:drawing>
+      </w:r>
+    </w:p>
+    <w:p>
+      <w:pPr>
+        <w:pStyle w:val="ImageCaption"/>
+      </w:pPr>
+      <w:r>
+        <w:t xml:space="preserve">Перемещение файла</w:t>
+      </w:r>
+    </w:p>
+    <w:bookmarkEnd w:id="72"/>
+    <w:bookmarkStart w:id="76" w:name="удаление-файла-f8"/>
+    <w:p>
+      <w:pPr>
+        <w:pStyle w:val="Heading3"/>
+      </w:pPr>
+      <w:r>
+        <w:t xml:space="preserve">3.4.4. Удаление файла (F8)</w:t>
+      </w:r>
+    </w:p>
+    <w:p>
+      <w:pPr>
+        <w:pStyle w:val="CaptionedFigure"/>
+      </w:pPr>
+      <w:r>
+        <w:drawing>
+          <wp:inline>
+            <wp:extent cx="3810000" cy="2540000"/>
+            <wp:effectExtent b="0" l="0" r="0" t="0"/>
+            <wp:docPr descr="Удаление файла" title="" id="74" name="Picture"/>
+            <a:graphic>
+              <a:graphicData uri="http://schemas.openxmlformats.org/drawingml/2006/picture">
+                <pic:pic>
+                  <pic:nvPicPr>
+                    <pic:cNvPr descr="images/mc_delete.png" id="75" name="Picture"/>
+                    <pic:cNvPicPr>
+                      <a:picLocks noChangeArrowheads="1" noChangeAspect="1"/>
+                    </pic:cNvPicPr>
+                  </pic:nvPicPr>
+                  <pic:blipFill>
+                    <a:blip r:embed="rId73"/>
+                    <a:stretch>
+                      <a:fillRect/>
+                    </a:stretch>
+                  </pic:blipFill>
+                  <pic:spPr bwMode="auto">
+                    <a:xfrm>
+                      <a:off x="0" y="0"/>
+                      <a:ext cx="3810000" cy="2540000"/>
+                    </a:xfrm>
+                    <a:prstGeom prst="rect">
+                      <a:avLst/>
+                    </a:prstGeom>
+                    <a:noFill/>
+                    <a:ln w="9525">
+                      <a:noFill/>
+                      <a:headEnd/>
+                      <a:tailEnd/>
+                    </a:ln>
+                  </pic:spPr>
+                </pic:pic>
+              </a:graphicData>
+            </a:graphic>
+          </wp:inline>
+        </w:drawing>
+      </w:r>
+    </w:p>
+    <w:p>
+      <w:pPr>
+        <w:pStyle w:val="ImageCaption"/>
+      </w:pPr>
+      <w:r>
+        <w:t xml:space="preserve">Удаление файла</w:t>
+      </w:r>
+    </w:p>
+    <w:bookmarkEnd w:id="76"/>
+    <w:bookmarkStart w:id="80" w:name="просмотр-информации-о-файле-ctrlx-i"/>
+    <w:p>
+      <w:pPr>
+        <w:pStyle w:val="Heading3"/>
+      </w:pPr>
+      <w:r>
+        <w:t xml:space="preserve">3.4.5. Просмотр информации о файле (Ctrl+x i)</w:t>
+      </w:r>
+    </w:p>
+    <w:p>
+      <w:pPr>
+        <w:pStyle w:val="CaptionedFigure"/>
+      </w:pPr>
+      <w:r>
+        <w:drawing>
+          <wp:inline>
+            <wp:extent cx="3810000" cy="2540000"/>
+            <wp:effectExtent b="0" l="0" r="0" t="0"/>
+            <wp:docPr descr="Информация о файле" title="" id="78" name="Picture"/>
+            <a:graphic>
+              <a:graphicData uri="http://schemas.openxmlformats.org/drawingml/2006/picture">
+                <pic:pic>
+                  <pic:nvPicPr>
+                    <pic:cNvPr descr="images/mc_file_info.png" id="79" name="Picture"/>
+                    <pic:cNvPicPr>
+                      <a:picLocks noChangeArrowheads="1" noChangeAspect="1"/>
+                    </pic:cNvPicPr>
+                  </pic:nvPicPr>
+                  <pic:blipFill>
+                    <a:blip r:embed="rId77"/>
+                    <a:stretch>
+                      <a:fillRect/>
+                    </a:stretch>
+                  </pic:blipFill>
+                  <pic:spPr bwMode="auto">
+                    <a:xfrm>
+                      <a:off x="0" y="0"/>
+                      <a:ext cx="3810000" cy="2540000"/>
+                    </a:xfrm>
+                    <a:prstGeom prst="rect">
+                      <a:avLst/>
+                    </a:prstGeom>
+                    <a:noFill/>
+                    <a:ln w="9525">
+                      <a:noFill/>
+                      <a:headEnd/>
+                      <a:tailEnd/>
+                    </a:ln>
+                  </pic:spPr>
+                </pic:pic>
+              </a:graphicData>
+            </a:graphic>
+          </wp:inline>
+        </w:drawing>
+      </w:r>
+    </w:p>
+    <w:p>
+      <w:pPr>
+        <w:pStyle w:val="ImageCaption"/>
+      </w:pPr>
+      <w:r>
+        <w:t xml:space="preserve">Информация о файле</w:t>
+      </w:r>
+    </w:p>
+    <w:bookmarkEnd w:id="80"/>
+    <w:bookmarkStart w:id="84" w:name="изменение-прав-доступа-ctrlx-c"/>
+    <w:p>
+      <w:pPr>
+        <w:pStyle w:val="Heading3"/>
+      </w:pPr>
+      <w:r>
+        <w:t xml:space="preserve">3.4.6. Изменение прав доступа (Ctrl+x c)</w:t>
+      </w:r>
+    </w:p>
+    <w:p>
+      <w:pPr>
+        <w:pStyle w:val="CaptionedFigure"/>
+      </w:pPr>
+      <w:r>
+        <w:drawing>
+          <wp:inline>
+            <wp:extent cx="3810000" cy="2540000"/>
+            <wp:effectExtent b="0" l="0" r="0" t="0"/>
+            <wp:docPr descr="Изменение прав доступа" title="" id="82" name="Picture"/>
+            <a:graphic>
+              <a:graphicData uri="http://schemas.openxmlformats.org/drawingml/2006/picture">
+                <pic:pic>
+                  <pic:nvPicPr>
+                    <pic:cNvPr descr="images/mc_chmod.png" id="83" name="Picture"/>
+                    <pic:cNvPicPr>
+                      <a:picLocks noChangeArrowheads="1" noChangeAspect="1"/>
+                    </pic:cNvPicPr>
+                  </pic:nvPicPr>
+                  <pic:blipFill>
+                    <a:blip r:embed="rId81"/>
+                    <a:stretch>
+                      <a:fillRect/>
+                    </a:stretch>
+                  </pic:blipFill>
+                  <pic:spPr bwMode="auto">
+                    <a:xfrm>
+                      <a:off x="0" y="0"/>
+                      <a:ext cx="3810000" cy="2540000"/>
+                    </a:xfrm>
+                    <a:prstGeom prst="rect">
+                      <a:avLst/>
+                    </a:prstGeom>
+                    <a:noFill/>
+                    <a:ln w="9525">
+                      <a:noFill/>
+                      <a:headEnd/>
+                      <a:tailEnd/>
+                    </a:ln>
+                  </pic:spPr>
+                </pic:pic>
+              </a:graphicData>
+            </a:graphic>
+          </wp:inline>
+        </w:drawing>
+      </w:r>
+    </w:p>
+    <w:p>
+      <w:pPr>
+        <w:pStyle w:val="ImageCaption"/>
+      </w:pPr>
+      <w:r>
+        <w:t xml:space="preserve">Изменение прав доступа</w:t>
+      </w:r>
+    </w:p>
+    <w:bookmarkEnd w:id="84"/>
+    <w:bookmarkStart w:id="88" w:name="создание-символической-ссылки-ctrlx-s"/>
+    <w:p>
+      <w:pPr>
+        <w:pStyle w:val="Heading3"/>
+      </w:pPr>
+      <w:r>
+        <w:t xml:space="preserve">3.4.7. Создание символической ссылки (Ctrl+x s)</w:t>
+      </w:r>
+    </w:p>
+    <w:p>
+      <w:pPr>
+        <w:pStyle w:val="CaptionedFigure"/>
+      </w:pPr>
+      <w:r>
+        <w:drawing>
+          <wp:inline>
+            <wp:extent cx="3810000" cy="2540000"/>
+            <wp:effectExtent b="0" l="0" r="0" t="0"/>
+            <wp:docPr descr="Создание символической ссылки" title="" id="86" name="Picture"/>
+            <a:graphic>
+              <a:graphicData uri="http://schemas.openxmlformats.org/drawingml/2006/picture">
+                <pic:pic>
+                  <pic:nvPicPr>
+                    <pic:cNvPr descr="images/mc_symlink.png" id="87" name="Picture"/>
+                    <pic:cNvPicPr>
+                      <a:picLocks noChangeArrowheads="1" noChangeAspect="1"/>
+                    </pic:cNvPicPr>
+                  </pic:nvPicPr>
+                  <pic:blipFill>
+                    <a:blip r:embed="rId85"/>
+                    <a:stretch>
+                      <a:fillRect/>
+                    </a:stretch>
+                  </pic:blipFill>
+                  <pic:spPr bwMode="auto">
+                    <a:xfrm>
+                      <a:off x="0" y="0"/>
+                      <a:ext cx="3810000" cy="2540000"/>
+                    </a:xfrm>
+                    <a:prstGeom prst="rect">
+                      <a:avLst/>
+                    </a:prstGeom>
+                    <a:noFill/>
+                    <a:ln w="9525">
+                      <a:noFill/>
+                      <a:headEnd/>
+                      <a:tailEnd/>
+                    </a:ln>
+                  </pic:spPr>
+                </pic:pic>
+              </a:graphicData>
+            </a:graphic>
+          </wp:inline>
+        </w:drawing>
+      </w:r>
+    </w:p>
+    <w:p>
+      <w:pPr>
+        <w:pStyle w:val="ImageCaption"/>
+      </w:pPr>
+      <w:r>
+        <w:t xml:space="preserve">Создание символической ссылки</w:t>
+      </w:r>
+    </w:p>
+    <w:bookmarkEnd w:id="88"/>
+    <w:bookmarkEnd w:id="89"/>
+    <w:bookmarkStart w:id="101" w:name="меню-command-команда"/>
+    <w:p>
+      <w:pPr>
+        <w:pStyle w:val="Heading2"/>
+      </w:pPr>
+      <w:r>
+        <w:t xml:space="preserve">3.5. Меню Command (Команда)</w:t>
+      </w:r>
+    </w:p>
+    <w:p>
+      <w:pPr>
+        <w:pStyle w:val="FirstParagraph"/>
+      </w:pPr>
+      <w:r>
+        <w:t xml:space="preserve">Меню Command содержит общие команды для работы с mc:</w:t>
+      </w:r>
+    </w:p>
+    <w:p>
+      <w:pPr>
+        <w:pStyle w:val="CaptionedFigure"/>
+      </w:pPr>
+      <w:r>
+        <w:drawing>
+          <wp:inline>
+            <wp:extent cx="3810000" cy="2540000"/>
+            <wp:effectExtent b="0" l="0" r="0" t="0"/>
+            <wp:docPr descr="Меню Command" title="" id="91" name="Picture"/>
+            <a:graphic>
+              <a:graphicData uri="http://schemas.openxmlformats.org/drawingml/2006/picture">
+                <pic:pic>
+                  <pic:nvPicPr>
+                    <pic:cNvPr descr="images/mc_command_menu.png" id="92" name="Picture"/>
+                    <pic:cNvPicPr>
+                      <a:picLocks noChangeArrowheads="1" noChangeAspect="1"/>
+                    </pic:cNvPicPr>
+                  </pic:nvPicPr>
+                  <pic:blipFill>
+                    <a:blip r:embed="rId90"/>
+                    <a:stretch>
+                      <a:fillRect/>
+                    </a:stretch>
+                  </pic:blipFill>
+                  <pic:spPr bwMode="auto">
+                    <a:xfrm>
+                      <a:off x="0" y="0"/>
+                      <a:ext cx="3810000" cy="2540000"/>
+                    </a:xfrm>
+                    <a:prstGeom prst="rect">
+                      <a:avLst/>
+                    </a:prstGeom>
+                    <a:noFill/>
+                    <a:ln w="9525">
+                      <a:noFill/>
+                      <a:headEnd/>
+                      <a:tailEnd/>
+                    </a:ln>
+                  </pic:spPr>
+                </pic:pic>
+              </a:graphicData>
+            </a:graphic>
+          </wp:inline>
+        </w:drawing>
+      </w:r>
+    </w:p>
+    <w:p>
+      <w:pPr>
+        <w:pStyle w:val="ImageCaption"/>
+      </w:pPr>
+      <w:r>
+        <w:t xml:space="preserve">Меню Command</w:t>
+      </w:r>
+    </w:p>
+    <w:bookmarkStart w:id="96" w:name="поиск-файла"/>
+    <w:p>
+      <w:pPr>
+        <w:pStyle w:val="Heading3"/>
+      </w:pPr>
+      <w:r>
+        <w:t xml:space="preserve">3.5.1. Поиск файла</w:t>
+      </w:r>
+    </w:p>
+    <w:p>
+      <w:pPr>
+        <w:pStyle w:val="FirstParagraph"/>
+      </w:pPr>
+      <w:r>
+        <w:t xml:space="preserve">Поиск файлов по заданным параметрам:</w:t>
+      </w:r>
+    </w:p>
+    <w:p>
+      <w:pPr>
+        <w:pStyle w:val="CaptionedFigure"/>
+      </w:pPr>
+      <w:r>
+        <w:drawing>
+          <wp:inline>
+            <wp:extent cx="3810000" cy="2540000"/>
+            <wp:effectExtent b="0" l="0" r="0" t="0"/>
+            <wp:docPr descr="Поиск файла" title="" id="94" name="Picture"/>
+            <a:graphic>
+              <a:graphicData uri="http://schemas.openxmlformats.org/drawingml/2006/picture">
+                <pic:pic>
+                  <pic:nvPicPr>
+                    <pic:cNvPr descr="images/mc_find_file.png" id="95" name="Picture"/>
+                    <pic:cNvPicPr>
+                      <a:picLocks noChangeArrowheads="1" noChangeAspect="1"/>
+                    </pic:cNvPicPr>
+                  </pic:nvPicPr>
+                  <pic:blipFill>
+                    <a:blip r:embed="rId93"/>
+                    <a:stretch>
+                      <a:fillRect/>
+                    </a:stretch>
+                  </pic:blipFill>
+                  <pic:spPr bwMode="auto">
+                    <a:xfrm>
+                      <a:off x="0" y="0"/>
+                      <a:ext cx="3810000" cy="2540000"/>
+                    </a:xfrm>
+                    <a:prstGeom prst="rect">
+                      <a:avLst/>
+                    </a:prstGeom>
+                    <a:noFill/>
+                    <a:ln w="9525">
+                      <a:noFill/>
+                      <a:headEnd/>
+                      <a:tailEnd/>
+                    </a:ln>
+                  </pic:spPr>
+                </pic:pic>
+              </a:graphicData>
+            </a:graphic>
+          </wp:inline>
+        </w:drawing>
+      </w:r>
+    </w:p>
+    <w:p>
+      <w:pPr>
+        <w:pStyle w:val="ImageCaption"/>
+      </w:pPr>
+      <w:r>
+        <w:t xml:space="preserve">Поиск файла</w:t>
+      </w:r>
+    </w:p>
+    <w:bookmarkEnd w:id="96"/>
+    <w:bookmarkStart w:id="100" w:name="история-командной-строки"/>
+    <w:p>
+      <w:pPr>
+        <w:pStyle w:val="Heading3"/>
+      </w:pPr>
+      <w:r>
+        <w:t xml:space="preserve">3.5.2. История командной строки</w:t>
+      </w:r>
+    </w:p>
+    <w:p>
+      <w:pPr>
+        <w:pStyle w:val="CaptionedFigure"/>
+      </w:pPr>
+      <w:r>
+        <w:drawing>
+          <wp:inline>
+            <wp:extent cx="3810000" cy="2540000"/>
+            <wp:effectExtent b="0" l="0" r="0" t="0"/>
+            <wp:docPr descr="История команд" title="" id="98" name="Picture"/>
+            <a:graphic>
+              <a:graphicData uri="http://schemas.openxmlformats.org/drawingml/2006/picture">
+                <pic:pic>
+                  <pic:nvPicPr>
+                    <pic:cNvPr descr="images/mc_history.png" id="99" name="Picture"/>
+                    <pic:cNvPicPr>
+                      <a:picLocks noChangeArrowheads="1" noChangeAspect="1"/>
+                    </pic:cNvPicPr>
+                  </pic:nvPicPr>
+                  <pic:blipFill>
+                    <a:blip r:embed="rId97"/>
+                    <a:stretch>
+                      <a:fillRect/>
+                    </a:stretch>
+                  </pic:blipFill>
+                  <pic:spPr bwMode="auto">
+                    <a:xfrm>
+                      <a:off x="0" y="0"/>
+                      <a:ext cx="3810000" cy="2540000"/>
+                    </a:xfrm>
+                    <a:prstGeom prst="rect">
+                      <a:avLst/>
+                    </a:prstGeom>
+                    <a:noFill/>
+                    <a:ln w="9525">
+                      <a:noFill/>
+                      <a:headEnd/>
+                      <a:tailEnd/>
+                    </a:ln>
+                  </pic:spPr>
+                </pic:pic>
+              </a:graphicData>
+            </a:graphic>
+          </wp:inline>
+        </w:drawing>
+      </w:r>
+    </w:p>
+    <w:p>
+      <w:pPr>
+        <w:pStyle w:val="ImageCaption"/>
+      </w:pPr>
+      <w:r>
+        <w:t xml:space="preserve">История команд</w:t>
+      </w:r>
+    </w:p>
+    <w:bookmarkEnd w:id="100"/>
+    <w:bookmarkEnd w:id="101"/>
+    <w:bookmarkStart w:id="108" w:name="меню-options-настройки"/>
+    <w:p>
+      <w:pPr>
+        <w:pStyle w:val="Heading2"/>
+      </w:pPr>
+      <w:r>
+        <w:t xml:space="preserve">3.6. Меню Options (Настройки)</w:t>
+      </w:r>
+    </w:p>
+    <w:p>
+      <w:pPr>
+        <w:pStyle w:val="FirstParagraph"/>
+      </w:pPr>
+      <w:r>
+        <w:t xml:space="preserve">Меню Options позволяет настраивать внешний вид и функциональность mc:</w:t>
+      </w:r>
+    </w:p>
+    <w:p>
+      <w:pPr>
+        <w:pStyle w:val="CaptionedFigure"/>
+      </w:pPr>
+      <w:r>
+        <w:drawing>
+          <wp:inline>
+            <wp:extent cx="3810000" cy="2540000"/>
+            <wp:effectExtent b="0" l="0" r="0" t="0"/>
+            <wp:docPr descr="Меню Options" title="" id="103" name="Picture"/>
+            <a:graphic>
+              <a:graphicData uri="http://schemas.openxmlformats.org/drawingml/2006/picture">
+                <pic:pic>
+                  <pic:nvPicPr>
+                    <pic:cNvPr descr="images/mc_options_menu.png" id="104" name="Picture"/>
+                    <pic:cNvPicPr>
+                      <a:picLocks noChangeArrowheads="1" noChangeAspect="1"/>
+                    </pic:cNvPicPr>
+                  </pic:nvPicPr>
+                  <pic:blipFill>
+                    <a:blip r:embed="rId102"/>
+                    <a:stretch>
+                      <a:fillRect/>
+                    </a:stretch>
+                  </pic:blipFill>
+                  <pic:spPr bwMode="auto">
+                    <a:xfrm>
+                      <a:off x="0" y="0"/>
+                      <a:ext cx="3810000" cy="2540000"/>
+                    </a:xfrm>
+                    <a:prstGeom prst="rect">
+                      <a:avLst/>
+                    </a:prstGeom>
+                    <a:noFill/>
+                    <a:ln w="9525">
+                      <a:noFill/>
+                      <a:headEnd/>
+                      <a:tailEnd/>
+                    </a:ln>
+                  </pic:spPr>
+                </pic:pic>
+              </a:graphicData>
+            </a:graphic>
+          </wp:inline>
+        </w:drawing>
+      </w:r>
+    </w:p>
+    <w:p>
+      <w:pPr>
+        <w:pStyle w:val="ImageCaption"/>
+      </w:pPr>
+      <w:r>
+        <w:t xml:space="preserve">Меню Options</w:t>
+      </w:r>
+    </w:p>
+    <w:p>
+      <w:pPr>
+        <w:pStyle w:val="BodyText"/>
+      </w:pPr>
+      <w:r>
+        <w:t xml:space="preserve">Настройка внешнего вида (Appearance):</w:t>
+      </w:r>
+    </w:p>
+    <w:p>
+      <w:pPr>
+        <w:pStyle w:val="CaptionedFigure"/>
+      </w:pPr>
+      <w:r>
+        <w:drawing>
+          <wp:inline>
+            <wp:extent cx="3810000" cy="2540000"/>
+            <wp:effectExtent b="0" l="0" r="0" t="0"/>
+            <wp:docPr descr="Настройка внешнего вида" title="" id="106" name="Picture"/>
+            <a:graphic>
+              <a:graphicData uri="http://schemas.openxmlformats.org/drawingml/2006/picture">
+                <pic:pic>
+                  <pic:nvPicPr>
+                    <pic:cNvPr descr="images/mc_appearance.png" id="107" name="Picture"/>
+                    <pic:cNvPicPr>
+                      <a:picLocks noChangeArrowheads="1" noChangeAspect="1"/>
+                    </pic:cNvPicPr>
+                  </pic:nvPicPr>
+                  <pic:blipFill>
+                    <a:blip r:embed="rId105"/>
+                    <a:stretch>
+                      <a:fillRect/>
+                    </a:stretch>
+                  </pic:blipFill>
+                  <pic:spPr bwMode="auto">
+                    <a:xfrm>
+                      <a:off x="0" y="0"/>
+                      <a:ext cx="3810000" cy="2540000"/>
+                    </a:xfrm>
+                    <a:prstGeom prst="rect">
+                      <a:avLst/>
+                    </a:prstGeom>
+                    <a:noFill/>
+                    <a:ln w="9525">
+                      <a:noFill/>
+                      <a:headEnd/>
+                      <a:tailEnd/>
+                    </a:ln>
+                  </pic:spPr>
+                </pic:pic>
+              </a:graphicData>
+            </a:graphic>
+          </wp:inline>
+        </w:drawing>
+      </w:r>
+    </w:p>
+    <w:p>
+      <w:pPr>
+        <w:pStyle w:val="ImageCaption"/>
+      </w:pPr>
+      <w:r>
+        <w:t xml:space="preserve">Настройка внешнего вида</w:t>
+      </w:r>
+    </w:p>
+    <w:bookmarkEnd w:id="108"/>
+    <w:bookmarkStart w:id="139" w:name="встроенный-редактор-mc"/>
+    <w:p>
+      <w:pPr>
+        <w:pStyle w:val="Heading2"/>
+      </w:pPr>
+      <w:r>
+        <w:t xml:space="preserve">3.7. Встроенный редактор mc</w:t>
+      </w:r>
+    </w:p>
+    <w:bookmarkStart w:id="115" w:name="создание-и-открытие-файла"/>
+    <w:p>
+      <w:pPr>
+        <w:pStyle w:val="Heading3"/>
+      </w:pPr>
+      <w:r>
+        <w:t xml:space="preserve">3.7.1. Создание и открытие файла</w:t>
+      </w:r>
+    </w:p>
+    <w:p>
+      <w:pPr>
+        <w:pStyle w:val="FirstParagraph"/>
+      </w:pPr>
+      <w:r>
+        <w:t xml:space="preserve">Создание файла</w:t>
+      </w:r>
+      <w:r>
+        <w:t xml:space="preserve"> </w:t>
+      </w:r>
+      <w:r>
+        <w:rPr>
+          <w:rStyle w:val="VerbatimChar"/>
+        </w:rPr>
+        <w:t xml:space="preserve">text.txt</w:t>
+      </w:r>
+      <w:r>
+        <w:t xml:space="preserve"> </w:t>
+      </w:r>
+      <w:r>
+        <w:t xml:space="preserve">и открытие его в редакторе (F4):</w:t>
+      </w:r>
+    </w:p>
+    <w:p>
+      <w:pPr>
+        <w:pStyle w:val="CaptionedFigure"/>
+      </w:pPr>
+      <w:r>
+        <w:drawing>
+          <wp:inline>
+            <wp:extent cx="3810000" cy="2540000"/>
+            <wp:effectExtent b="0" l="0" r="0" t="0"/>
+            <wp:docPr descr="Создание файла" title="" id="110" name="Picture"/>
+            <a:graphic>
+              <a:graphicData uri="http://schemas.openxmlformats.org/drawingml/2006/picture">
+                <pic:pic>
+                  <pic:nvPicPr>
+                    <pic:cNvPr descr="images/mc_editor_create.png" id="111" name="Picture"/>
+                    <pic:cNvPicPr>
+                      <a:picLocks noChangeArrowheads="1" noChangeAspect="1"/>
+                    </pic:cNvPicPr>
+                  </pic:nvPicPr>
+                  <pic:blipFill>
+                    <a:blip r:embed="rId109"/>
+                    <a:stretch>
+                      <a:fillRect/>
+                    </a:stretch>
+                  </pic:blipFill>
+                  <pic:spPr bwMode="auto">
+                    <a:xfrm>
+                      <a:off x="0" y="0"/>
+                      <a:ext cx="3810000" cy="2540000"/>
+                    </a:xfrm>
+                    <a:prstGeom prst="rect">
+                      <a:avLst/>
+                    </a:prstGeom>
+                    <a:noFill/>
+                    <a:ln w="9525">
+                      <a:noFill/>
+                      <a:headEnd/>
+                      <a:tailEnd/>
+                    </a:ln>
+                  </pic:spPr>
+                </pic:pic>
+              </a:graphicData>
+            </a:graphic>
+          </wp:inline>
+        </w:drawing>
+      </w:r>
+    </w:p>
+    <w:p>
+      <w:pPr>
+        <w:pStyle w:val="ImageCaption"/>
+      </w:pPr>
+      <w:r>
+        <w:t xml:space="preserve">Создание файла</w:t>
+      </w:r>
+    </w:p>
+    <w:p>
+      <w:pPr>
+        <w:pStyle w:val="CaptionedFigure"/>
+      </w:pPr>
+      <w:r>
+        <w:drawing>
+          <wp:inline>
+            <wp:extent cx="3810000" cy="2540000"/>
+            <wp:effectExtent b="0" l="0" r="0" t="0"/>
+            <wp:docPr descr="Открытие в редакторе" title="" id="113" name="Picture"/>
+            <a:graphic>
+              <a:graphicData uri="http://schemas.openxmlformats.org/drawingml/2006/picture">
+                <pic:pic>
+                  <pic:nvPicPr>
+                    <pic:cNvPr descr="images/mc_editor_open.png" id="114" name="Picture"/>
+                    <pic:cNvPicPr>
+                      <a:picLocks noChangeArrowheads="1" noChangeAspect="1"/>
+                    </pic:cNvPicPr>
+                  </pic:nvPicPr>
+                  <pic:blipFill>
+                    <a:blip r:embed="rId112"/>
+                    <a:stretch>
+                      <a:fillRect/>
+                    </a:stretch>
+                  </pic:blipFill>
+                  <pic:spPr bwMode="auto">
+                    <a:xfrm>
+                      <a:off x="0" y="0"/>
+                      <a:ext cx="3810000" cy="2540000"/>
+                    </a:xfrm>
+                    <a:prstGeom prst="rect">
+                      <a:avLst/>
+                    </a:prstGeom>
+                    <a:noFill/>
+                    <a:ln w="9525">
+                      <a:noFill/>
+                      <a:headEnd/>
+                      <a:tailEnd/>
+                    </a:ln>
+                  </pic:spPr>
+                </pic:pic>
+              </a:graphicData>
+            </a:graphic>
+          </wp:inline>
+        </w:drawing>
+      </w:r>
+    </w:p>
+    <w:p>
+      <w:pPr>
+        <w:pStyle w:val="ImageCaption"/>
+      </w:pPr>
+      <w:r>
+        <w:t xml:space="preserve">Открытие в редакторе</w:t>
+      </w:r>
+    </w:p>
+    <w:bookmarkEnd w:id="115"/>
+    <w:bookmarkStart w:id="134" w:name="редактирование-текста"/>
+    <w:p>
+      <w:pPr>
+        <w:pStyle w:val="Heading3"/>
+      </w:pPr>
+      <w:r>
+        <w:t xml:space="preserve">3.7.2. Редактирование текста</w:t>
+      </w:r>
+    </w:p>
+    <w:p>
+      <w:pPr>
+        <w:pStyle w:val="FirstParagraph"/>
+      </w:pPr>
+      <w:r>
+        <w:t xml:space="preserve">Вставка текста в редактор:</w:t>
+      </w:r>
+    </w:p>
+    <w:p>
+      <w:pPr>
+        <w:pStyle w:val="CaptionedFigure"/>
+      </w:pPr>
+      <w:r>
+        <w:drawing>
+          <wp:inline>
+            <wp:extent cx="3810000" cy="2540000"/>
+            <wp:effectExtent b="0" l="0" r="0" t="0"/>
+            <wp:docPr descr="Вставка текста" title="" id="117" name="Picture"/>
+            <a:graphic>
+              <a:graphicData uri="http://schemas.openxmlformats.org/drawingml/2006/picture">
+                <pic:pic>
+                  <pic:nvPicPr>
+                    <pic:cNvPr descr="images/mc_editor_insert.png" id="118" name="Picture"/>
+                    <pic:cNvPicPr>
+                      <a:picLocks noChangeArrowheads="1" noChangeAspect="1"/>
+                    </pic:cNvPicPr>
+                  </pic:nvPicPr>
+                  <pic:blipFill>
+                    <a:blip r:embed="rId116"/>
+                    <a:stretch>
+                      <a:fillRect/>
+                    </a:stretch>
+                  </pic:blipFill>
+                  <pic:spPr bwMode="auto">
+                    <a:xfrm>
+                      <a:off x="0" y="0"/>
+                      <a:ext cx="3810000" cy="2540000"/>
+                    </a:xfrm>
+                    <a:prstGeom prst="rect">
+                      <a:avLst/>
+                    </a:prstGeom>
+                    <a:noFill/>
+                    <a:ln w="9525">
+                      <a:noFill/>
+                      <a:headEnd/>
+                      <a:tailEnd/>
+                    </a:ln>
+                  </pic:spPr>
+                </pic:pic>
+              </a:graphicData>
+            </a:graphic>
+          </wp:inline>
+        </w:drawing>
+      </w:r>
+    </w:p>
+    <w:p>
+      <w:pPr>
+        <w:pStyle w:val="ImageCaption"/>
+      </w:pPr>
+      <w:r>
+        <w:t xml:space="preserve">Вставка текста</w:t>
+      </w:r>
+    </w:p>
+    <w:p>
+      <w:pPr>
+        <w:pStyle w:val="BodyText"/>
+      </w:pPr>
+      <w:r>
+        <w:t xml:space="preserve">Удаление строки текста:</w:t>
+      </w:r>
+    </w:p>
+    <w:p>
+      <w:pPr>
+        <w:pStyle w:val="CaptionedFigure"/>
+      </w:pPr>
+      <w:r>
+        <w:drawing>
+          <wp:inline>
+            <wp:extent cx="3810000" cy="2540000"/>
+            <wp:effectExtent b="0" l="0" r="0" t="0"/>
+            <wp:docPr descr="Удаление строки" title="" id="120" name="Picture"/>
+            <a:graphic>
+              <a:graphicData uri="http://schemas.openxmlformats.org/drawingml/2006/picture">
+                <pic:pic>
+                  <pic:nvPicPr>
+                    <pic:cNvPr descr="images/mc_editor_delete_line.png" id="121" name="Picture"/>
+                    <pic:cNvPicPr>
+                      <a:picLocks noChangeArrowheads="1" noChangeAspect="1"/>
+                    </pic:cNvPicPr>
+                  </pic:nvPicPr>
+                  <pic:blipFill>
+                    <a:blip r:embed="rId119"/>
+                    <a:stretch>
+                      <a:fillRect/>
+                    </a:stretch>
+                  </pic:blipFill>
+                  <pic:spPr bwMode="auto">
+                    <a:xfrm>
+                      <a:off x="0" y="0"/>
+                      <a:ext cx="3810000" cy="2540000"/>
+                    </a:xfrm>
+                    <a:prstGeom prst="rect">
+                      <a:avLst/>
+                    </a:prstGeom>
+                    <a:noFill/>
+                    <a:ln w="9525">
+                      <a:noFill/>
+                      <a:headEnd/>
+                      <a:tailEnd/>
+                    </a:ln>
+                  </pic:spPr>
+                </pic:pic>
+              </a:graphicData>
+            </a:graphic>
+          </wp:inline>
+        </w:drawing>
+      </w:r>
+    </w:p>
+    <w:p>
+      <w:pPr>
+        <w:pStyle w:val="ImageCaption"/>
+      </w:pPr>
+      <w:r>
+        <w:t xml:space="preserve">Удаление строки</w:t>
+      </w:r>
+    </w:p>
+    <w:p>
+      <w:pPr>
+        <w:pStyle w:val="BodyText"/>
+      </w:pPr>
+      <w:r>
+        <w:t xml:space="preserve">Копирование и вставка фрагмента текста:</w:t>
+      </w:r>
+    </w:p>
+    <w:p>
+      <w:pPr>
+        <w:pStyle w:val="CaptionedFigure"/>
+      </w:pPr>
+      <w:r>
+        <w:drawing>
+          <wp:inline>
+            <wp:extent cx="3810000" cy="2540000"/>
+            <wp:effectExtent b="0" l="0" r="0" t="0"/>
+            <wp:docPr descr="Копирование/вставка" title="" id="123" name="Picture"/>
+            <a:graphic>
+              <a:graphicData uri="http://schemas.openxmlformats.org/drawingml/2006/picture">
+                <pic:pic>
+                  <pic:nvPicPr>
+                    <pic:cNvPr descr="images/mc_editor_copy_paste.png" id="124" name="Picture"/>
+                    <pic:cNvPicPr>
+                      <a:picLocks noChangeArrowheads="1" noChangeAspect="1"/>
+                    </pic:cNvPicPr>
+                  </pic:nvPicPr>
+                  <pic:blipFill>
+                    <a:blip r:embed="rId122"/>
+                    <a:stretch>
+                      <a:fillRect/>
+                    </a:stretch>
+                  </pic:blipFill>
+                  <pic:spPr bwMode="auto">
+                    <a:xfrm>
+                      <a:off x="0" y="0"/>
+                      <a:ext cx="3810000" cy="2540000"/>
+                    </a:xfrm>
+                    <a:prstGeom prst="rect">
+                      <a:avLst/>
+                    </a:prstGeom>
+                    <a:noFill/>
+                    <a:ln w="9525">
+                      <a:noFill/>
+                      <a:headEnd/>
+                      <a:tailEnd/>
+                    </a:ln>
+                  </pic:spPr>
+                </pic:pic>
+              </a:graphicData>
+            </a:graphic>
+          </wp:inline>
+        </w:drawing>
+      </w:r>
+    </w:p>
+    <w:p>
+      <w:pPr>
+        <w:pStyle w:val="ImageCaption"/>
+      </w:pPr>
+      <w:r>
+        <w:t xml:space="preserve">Копирование/вставка</w:t>
+      </w:r>
+    </w:p>
+    <w:p>
+      <w:pPr>
+        <w:pStyle w:val="BodyText"/>
+      </w:pPr>
+      <w:r>
+        <w:t xml:space="preserve">Отмена последнего действия (</w:t>
+      </w:r>
+      <w:r>
+        <w:rPr>
+          <w:rStyle w:val="VerbatimChar"/>
+        </w:rPr>
+        <w:t xml:space="preserve">Ctrl+u</w:t>
+      </w:r>
+      <w:r>
+        <w:t xml:space="preserve">):</w:t>
+      </w:r>
+    </w:p>
+    <w:p>
+      <w:pPr>
+        <w:pStyle w:val="CaptionedFigure"/>
+      </w:pPr>
+      <w:r>
+        <w:drawing>
+          <wp:inline>
+            <wp:extent cx="3810000" cy="2540000"/>
+            <wp:effectExtent b="0" l="0" r="0" t="0"/>
+            <wp:docPr descr="Отмена действия" title="" id="126" name="Picture"/>
+            <a:graphic>
+              <a:graphicData uri="http://schemas.openxmlformats.org/drawingml/2006/picture">
+                <pic:pic>
+                  <pic:nvPicPr>
+                    <pic:cNvPr descr="images/mc_editor_undo.png" id="127" name="Picture"/>
+                    <pic:cNvPicPr>
+                      <a:picLocks noChangeArrowheads="1" noChangeAspect="1"/>
+                    </pic:cNvPicPr>
+                  </pic:nvPicPr>
+                  <pic:blipFill>
+                    <a:blip r:embed="rId125"/>
+                    <a:stretch>
+                      <a:fillRect/>
+                    </a:stretch>
+                  </pic:blipFill>
+                  <pic:spPr bwMode="auto">
+                    <a:xfrm>
+                      <a:off x="0" y="0"/>
+                      <a:ext cx="3810000" cy="2540000"/>
+                    </a:xfrm>
+                    <a:prstGeom prst="rect">
+                      <a:avLst/>
+                    </a:prstGeom>
+                    <a:noFill/>
+                    <a:ln w="9525">
+                      <a:noFill/>
+                      <a:headEnd/>
+                      <a:tailEnd/>
+                    </a:ln>
+                  </pic:spPr>
+                </pic:pic>
+              </a:graphicData>
+            </a:graphic>
+          </wp:inline>
+        </w:drawing>
+      </w:r>
+    </w:p>
+    <w:p>
+      <w:pPr>
+        <w:pStyle w:val="ImageCaption"/>
+      </w:pPr>
+      <w:r>
+        <w:t xml:space="preserve">Отмена действия</w:t>
+      </w:r>
+    </w:p>
+    <w:p>
+      <w:pPr>
+        <w:pStyle w:val="BodyText"/>
+      </w:pPr>
+      <w:r>
+        <w:t xml:space="preserve">Сохранение файла (F2):</w:t>
+      </w:r>
+    </w:p>
+    <w:p>
+      <w:pPr>
+        <w:pStyle w:val="CaptionedFigure"/>
+      </w:pPr>
+      <w:r>
+        <w:drawing>
+          <wp:inline>
+            <wp:extent cx="3810000" cy="2540000"/>
+            <wp:effectExtent b="0" l="0" r="0" t="0"/>
+            <wp:docPr descr="Сохранение файла" title="" id="129" name="Picture"/>
+            <a:graphic>
+              <a:graphicData uri="http://schemas.openxmlformats.org/drawingml/2006/picture">
+                <pic:pic>
+                  <pic:nvPicPr>
+                    <pic:cNvPr descr="images/mc_editor_save.png" id="130" name="Picture"/>
+                    <pic:cNvPicPr>
+                      <a:picLocks noChangeArrowheads="1" noChangeAspect="1"/>
+                    </pic:cNvPicPr>
+                  </pic:nvPicPr>
+                  <pic:blipFill>
+                    <a:blip r:embed="rId128"/>
+                    <a:stretch>
+                      <a:fillRect/>
+                    </a:stretch>
+                  </pic:blipFill>
+                  <pic:spPr bwMode="auto">
+                    <a:xfrm>
+                      <a:off x="0" y="0"/>
+                      <a:ext cx="3810000" cy="2540000"/>
+                    </a:xfrm>
+                    <a:prstGeom prst="rect">
+                      <a:avLst/>
+                    </a:prstGeom>
+                    <a:noFill/>
+                    <a:ln w="9525">
+                      <a:noFill/>
+                      <a:headEnd/>
+                      <a:tailEnd/>
+                    </a:ln>
+                  </pic:spPr>
+                </pic:pic>
+              </a:graphicData>
+            </a:graphic>
+          </wp:inline>
+        </w:drawing>
+      </w:r>
+    </w:p>
+    <w:p>
+      <w:pPr>
+        <w:pStyle w:val="ImageCaption"/>
+      </w:pPr>
+      <w:r>
+        <w:t xml:space="preserve">Сохранение файла</w:t>
+      </w:r>
+    </w:p>
+    <w:p>
+      <w:pPr>
+        <w:pStyle w:val="BodyText"/>
+      </w:pPr>
+      <w:r>
+        <w:t xml:space="preserve">Навигация по файлу (перемещение в начало/конец):</w:t>
+      </w:r>
+    </w:p>
+    <w:p>
+      <w:pPr>
+        <w:pStyle w:val="CaptionedFigure"/>
+      </w:pPr>
+      <w:r>
+        <w:drawing>
+          <wp:inline>
+            <wp:extent cx="3810000" cy="2540000"/>
+            <wp:effectExtent b="0" l="0" r="0" t="0"/>
+            <wp:docPr descr="Навигация" title="" id="132" name="Picture"/>
+            <a:graphic>
+              <a:graphicData uri="http://schemas.openxmlformats.org/drawingml/2006/picture">
+                <pic:pic>
+                  <pic:nvPicPr>
+                    <pic:cNvPr descr="images/mc_editor_navigation.png" id="133" name="Picture"/>
+                    <pic:cNvPicPr>
+                      <a:picLocks noChangeArrowheads="1" noChangeAspect="1"/>
+                    </pic:cNvPicPr>
+                  </pic:nvPicPr>
+                  <pic:blipFill>
+                    <a:blip r:embed="rId131"/>
+                    <a:stretch>
+                      <a:fillRect/>
+                    </a:stretch>
+                  </pic:blipFill>
+                  <pic:spPr bwMode="auto">
+                    <a:xfrm>
+                      <a:off x="0" y="0"/>
+                      <a:ext cx="3810000" cy="2540000"/>
+                    </a:xfrm>
+                    <a:prstGeom prst="rect">
+                      <a:avLst/>
+                    </a:prstGeom>
+                    <a:noFill/>
+                    <a:ln w="9525">
+                      <a:noFill/>
+                      <a:headEnd/>
+                      <a:tailEnd/>
+                    </a:ln>
+                  </pic:spPr>
+                </pic:pic>
+              </a:graphicData>
+            </a:graphic>
+          </wp:inline>
+        </w:drawing>
+      </w:r>
+    </w:p>
+    <w:p>
+      <w:pPr>
+        <w:pStyle w:val="ImageCaption"/>
+      </w:pPr>
+      <w:r>
+        <w:t xml:space="preserve">Навигация</w:t>
+      </w:r>
+    </w:p>
+    <w:bookmarkEnd w:id="134"/>
+    <w:bookmarkStart w:id="138" w:name="подсветка-синтаксиса"/>
+    <w:p>
+      <w:pPr>
+        <w:pStyle w:val="Heading3"/>
+      </w:pPr>
+      <w:r>
+        <w:t xml:space="preserve">3.7.3. Подсветка синтаксиса</w:t>
+      </w:r>
+    </w:p>
+    <w:p>
+      <w:pPr>
+        <w:pStyle w:val="FirstParagraph"/>
+      </w:pPr>
+      <w:r>
+        <w:t xml:space="preserve">Для файлов с исходным кодом можно включить подсветку синтаксиса:</w:t>
+      </w:r>
+    </w:p>
+    <w:p>
+      <w:pPr>
+        <w:pStyle w:val="CaptionedFigure"/>
+      </w:pPr>
+      <w:r>
+        <w:drawing>
+          <wp:inline>
+            <wp:extent cx="3810000" cy="2540000"/>
+            <wp:effectExtent b="0" l="0" r="0" t="0"/>
+            <wp:docPr descr="Подсветка синтаксиса" title="" id="136" name="Picture"/>
+            <a:graphic>
+              <a:graphicData uri="http://schemas.openxmlformats.org/drawingml/2006/picture">
+                <pic:pic>
+                  <pic:nvPicPr>
+                    <pic:cNvPr descr="images/mc_editor_syntax.png" id="137" name="Picture"/>
+                    <pic:cNvPicPr>
+                      <a:picLocks noChangeArrowheads="1" noChangeAspect="1"/>
+                    </pic:cNvPicPr>
+                  </pic:nvPicPr>
+                  <pic:blipFill>
+                    <a:blip r:embed="rId135"/>
+                    <a:stretch>
+                      <a:fillRect/>
+                    </a:stretch>
+                  </pic:blipFill>
+                  <pic:spPr bwMode="auto">
+                    <a:xfrm>
+                      <a:off x="0" y="0"/>
+                      <a:ext cx="3810000" cy="2540000"/>
+                    </a:xfrm>
+                    <a:prstGeom prst="rect">
+                      <a:avLst/>
+                    </a:prstGeom>
+                    <a:noFill/>
+                    <a:ln w="9525">
+                      <a:noFill/>
+                      <a:headEnd/>
+                      <a:tailEnd/>
+                    </a:ln>
+                  </pic:spPr>
+                </pic:pic>
+              </a:graphicData>
+            </a:graphic>
+          </wp:inline>
+        </w:drawing>
+      </w:r>
+    </w:p>
+    <w:p>
+      <w:pPr>
+        <w:pStyle w:val="ImageCaption"/>
+      </w:pPr>
+      <w:r>
+        <w:t xml:space="preserve">Подсветка синтаксиса</w:t>
+      </w:r>
+    </w:p>
+    <w:bookmarkEnd w:id="138"/>
+    <w:bookmarkEnd w:id="139"/>
+    <w:bookmarkStart w:id="143" w:name="завершение-работы"/>
+    <w:p>
+      <w:pPr>
+        <w:pStyle w:val="Heading2"/>
+      </w:pPr>
+      <w:r>
+        <w:t xml:space="preserve">3.8. Завершение работы</w:t>
+      </w:r>
+    </w:p>
+    <w:p>
+      <w:pPr>
+        <w:pStyle w:val="FirstParagraph"/>
+      </w:pPr>
+      <w:r>
+        <w:t xml:space="preserve">Выход из mc осуществляется клавишей F10:</w:t>
+      </w:r>
+    </w:p>
+    <w:p>
+      <w:pPr>
+        <w:pStyle w:val="CaptionedFigure"/>
+      </w:pPr>
+      <w:r>
+        <w:drawing>
+          <wp:inline>
+            <wp:extent cx="3810000" cy="2540000"/>
+            <wp:effectExtent b="0" l="0" r="0" t="0"/>
+            <wp:docPr descr="Выход из mc" title="" id="141" name="Picture"/>
+            <a:graphic>
+              <a:graphicData uri="http://schemas.openxmlformats.org/drawingml/2006/picture">
+                <pic:pic>
+                  <pic:nvPicPr>
+                    <pic:cNvPr descr="images/mc_quit.png" id="142" name="Picture"/>
+                    <pic:cNvPicPr>
+                      <a:picLocks noChangeArrowheads="1" noChangeAspect="1"/>
+                    </pic:cNvPicPr>
+                  </pic:nvPicPr>
+                  <pic:blipFill>
+                    <a:blip r:embed="rId140"/>
+                    <a:stretch>
+                      <a:fillRect/>
+                    </a:stretch>
+                  </pic:blipFill>
+                  <pic:spPr bwMode="auto">
+                    <a:xfrm>
+                      <a:off x="0" y="0"/>
+                      <a:ext cx="3810000" cy="2540000"/>
+                    </a:xfrm>
+                    <a:prstGeom prst="rect">
+                      <a:avLst/>
+                    </a:prstGeom>
+                    <a:noFill/>
+                    <a:ln w="9525">
+                      <a:noFill/>
+                      <a:headEnd/>
+                      <a:tailEnd/>
+                    </a:ln>
+                  </pic:spPr>
+                </pic:pic>
+              </a:graphicData>
+            </a:graphic>
+          </wp:inline>
+        </w:drawing>
+      </w:r>
+    </w:p>
+    <w:p>
+      <w:pPr>
+        <w:pStyle w:val="ImageCaption"/>
+      </w:pPr>
+      <w:r>
+        <w:t xml:space="preserve">Выход из mc</w:t>
+      </w:r>
+    </w:p>
+    <w:bookmarkEnd w:id="143"/>
+    <w:bookmarkEnd w:id="144"/>
+    <w:bookmarkStart w:id="145" w:name="выводы"/>
+    <w:p>
+      <w:pPr>
+        <w:pStyle w:val="Heading1"/>
+      </w:pPr>
+      <w:r>
+        <w:t xml:space="preserve">4. Выводы</w:t>
+      </w:r>
+    </w:p>
+    <w:p>
+      <w:pPr>
+        <w:pStyle w:val="FirstParagraph"/>
+      </w:pPr>
+      <w:r>
+        <w:t xml:space="preserve">В ходе выполнения лабораторной работы были освоены основные возможности командной оболочки Midnight Commander. Приобретены навыки навигации по файловой системе, управления панелями, выполнения операций с файлами (копирование, перемещение, удаление, изменение прав доступа), работы с встроенным редактором. Midnight Commander является мощным инструментом для эффективной работы в командной строке Linux.</w:t>
+      </w:r>
+    </w:p>
+    <w:bookmarkEnd w:id="145"/>
+    <w:bookmarkStart w:id="146" w:name="ответы-на-контрольные-вопросы"/>
+    <w:p>
+      <w:pPr>
+        <w:pStyle w:val="Heading1"/>
+      </w:pPr>
+      <w:r>
+        <w:t xml:space="preserve">5. Ответы на контрольные вопросы</w:t>
+      </w:r>
+    </w:p>
+    <w:p>
+      <w:pPr>
+        <w:pStyle w:val="FirstParagraph"/>
+      </w:pPr>
+      <w:r>
+        <w:rPr>
+          <w:b/>
+          <w:bCs/>
+        </w:rPr>
+        <w:t xml:space="preserve">1. Какие режимы работы есть в mc? Охарактеризуйте их.</w:t>
+      </w:r>
+      <w:r>
+        <w:br/>
+      </w:r>
+      <w:r>
+        <w:t xml:space="preserve">mc имеет следующие режимы отображения панелей: Standard (стандартный список файлов), Info (информация о файле и системе), Tree (дерево каталогов), Quick View (быстрый просмотр файла).</w:t>
+      </w:r>
+    </w:p>
+    <w:p>
+      <w:pPr>
+        <w:pStyle w:val="BodyText"/>
+      </w:pPr>
+      <w:r>
+        <w:rPr>
+          <w:b/>
+          <w:bCs/>
+        </w:rPr>
+        <w:t xml:space="preserve">2. Какие операции с файлами можно выполнить как с помощью команд shell, так и с помощью меню mc? Приведите примеры.</w:t>
+      </w:r>
+      <w:r>
+        <w:br/>
+      </w:r>
+      <w:r>
+        <w:t xml:space="preserve">Копирование (cp → F5), перемещение (mv → F6), удаление (rm → F8), изменение прав доступа (chmod → Ctrl+x c), создание ссылок (ln → Ctrl+x s).</w:t>
+      </w:r>
+    </w:p>
+    <w:p>
+      <w:pPr>
+        <w:pStyle w:val="BodyText"/>
+      </w:pPr>
+      <w:r>
+        <w:rPr>
+          <w:b/>
+          <w:bCs/>
+        </w:rPr>
+        <w:t xml:space="preserve">3. Опишите структуру меню левой (или правой) панели mc, дайте характеристику командам.</w:t>
+      </w:r>
+      <w:r>
+        <w:br/>
+      </w:r>
+      <w:r>
+        <w:t xml:space="preserve">Меню панели содержит: List mode (режим списка), Info mode (режим информации), Tree mode (режим дерева), Quick View (быстрый просмотр), Filter (фильтр), Re-read (перечитать), Sort order (сортировка).</w:t>
+      </w:r>
+    </w:p>
+    <w:p>
+      <w:pPr>
+        <w:pStyle w:val="BodyText"/>
+      </w:pPr>
+      <w:r>
+        <w:rPr>
+          <w:b/>
+          <w:bCs/>
+        </w:rPr>
+        <w:t xml:space="preserve">4. Опишите структуру меню File mc, дайте характеристику командам.</w:t>
+      </w:r>
+      <w:r>
+        <w:br/>
+      </w:r>
+      <w:r>
+        <w:t xml:space="preserve">Меню File включает: New file (новый файл), Copy (копирование), Move (перемещение), Delete (удаление), Rename (переименование), Link (ссылка), Edit (редактирование), View (просмотр), Chmod (права доступа), Chown (владелец).</w:t>
+      </w:r>
+    </w:p>
+    <w:p>
+      <w:pPr>
+        <w:pStyle w:val="BodyText"/>
+      </w:pPr>
+      <w:r>
+        <w:rPr>
+          <w:b/>
+          <w:bCs/>
+        </w:rPr>
+        <w:t xml:space="preserve">5. Опишите структуру меню Command mc, дайте характеристику командам.</w:t>
+      </w:r>
+      <w:r>
+        <w:br/>
+      </w:r>
+      <w:r>
+        <w:t xml:space="preserve">Меню Command содержит: Find file (поиск файлов), Directory tree (дерево каталогов), Swap panels (переставить панели), Compare directories (сравнить каталоги), Command line history (история команд), Directory hotlist (каталоги быстрого доступа).</w:t>
+      </w:r>
+    </w:p>
+    <w:p>
+      <w:pPr>
+        <w:pStyle w:val="BodyText"/>
+      </w:pPr>
+      <w:r>
+        <w:rPr>
+          <w:b/>
+          <w:bCs/>
+        </w:rPr>
+        <w:t xml:space="preserve">6. Опишите структуру меню Options mc, дайте характеристику командам.</w:t>
+      </w:r>
+      <w:r>
+        <w:br/>
+      </w:r>
+      <w:r>
+        <w:t xml:space="preserve">Меню Options включает: Configuration (конфигурация), Appearance (внешний вид), Panel options (настройки панелей), Confirmation (подтверждения), Learn keys (обучение клавишам), Virtual FS (виртуальная ФС).</w:t>
+      </w:r>
+    </w:p>
+    <w:p>
+      <w:pPr>
+        <w:pStyle w:val="BodyText"/>
+      </w:pPr>
+      <w:r>
+        <w:rPr>
+          <w:b/>
+          <w:bCs/>
+        </w:rPr>
+        <w:t xml:space="preserve">7. Назовите и дайте характеристику встроенным командам mc.</w:t>
+      </w:r>
+      <w:r>
+        <w:br/>
+      </w:r>
+      <w:r>
+        <w:t xml:space="preserve">Встроенные команды: F1 (Help), F2 (User menu), F3 (View), F4 (Edit), F5 (Copy), F6 (Move/Rename), F7 (Mkdir), F8 (Delete), F9 (Menu), F10 (Quit), Ctrl+o (Shell output), Ctrl+u (Swap panels).</w:t>
+      </w:r>
+    </w:p>
+    <w:p>
+      <w:pPr>
+        <w:pStyle w:val="BodyText"/>
+      </w:pPr>
+      <w:r>
+        <w:rPr>
+          <w:b/>
+          <w:bCs/>
+        </w:rPr>
+        <w:t xml:space="preserve">8. Назовите и дайте характеристику командам встроенного редактора mc.</w:t>
+      </w:r>
+      <w:r>
+        <w:br/>
+      </w:r>
+      <w:r>
+        <w:t xml:space="preserve">Встроенный редактор поддерживает: Ctrl+y (удалить строку), Ctrl+k (вырезать до конца строки), Ctrl+u (отменить), Ctrl+Insert (копировать), Shift+Insert (вставить), F2 (сохранить), F4 (сохранить и выйти).</w:t>
+      </w:r>
+    </w:p>
+    <w:p>
+      <w:pPr>
+        <w:pStyle w:val="BodyText"/>
+      </w:pPr>
+      <w:r>
+        <w:rPr>
+          <w:b/>
+          <w:bCs/>
+        </w:rPr>
+        <w:t xml:space="preserve">9. Дайте характеристику средствам mc, которые позволяют создавать меню, определяемое пользователем.</w:t>
+      </w:r>
+      <w:r>
+        <w:br/>
+      </w:r>
+      <w:r>
+        <w:t xml:space="preserve">Файл</w:t>
+      </w:r>
+      <w:r>
+        <w:t xml:space="preserve"> </w:t>
+      </w:r>
+      <w:r>
+        <w:rPr>
+          <w:rStyle w:val="VerbatimChar"/>
+        </w:rPr>
+        <w:t xml:space="preserve">~/.config/mc/menu</w:t>
+      </w:r>
+      <w:r>
+        <w:t xml:space="preserve"> </w:t>
+      </w:r>
+      <w:r>
+        <w:t xml:space="preserve">(или</w:t>
+      </w:r>
+      <w:r>
+        <w:t xml:space="preserve"> </w:t>
+      </w:r>
+      <w:r>
+        <w:rPr>
+          <w:rStyle w:val="VerbatimChar"/>
+        </w:rPr>
+        <w:t xml:space="preserve">~/.mc/menu</w:t>
+      </w:r>
+      <w:r>
+        <w:t xml:space="preserve">) позволяет создавать пользовательские меню, вызываемые клавишей F2.</w:t>
+      </w:r>
+    </w:p>
+    <w:p>
+      <w:pPr>
+        <w:pStyle w:val="BodyText"/>
+      </w:pPr>
+      <w:r>
+        <w:rPr>
+          <w:b/>
+          <w:bCs/>
+        </w:rPr>
+        <w:t xml:space="preserve">10. Дайте характеристику средствам mc, которые позволяют выполнять действия, определяемое пользователем, над текущим файлом.</w:t>
+      </w:r>
+      <w:r>
+        <w:br/>
+      </w:r>
+      <w:r>
+        <w:t xml:space="preserve">Расширения файлов задаются в файле</w:t>
+      </w:r>
+      <w:r>
+        <w:t xml:space="preserve"> </w:t>
+      </w:r>
+      <w:r>
+        <w:rPr>
+          <w:rStyle w:val="VerbatimChar"/>
+        </w:rPr>
+        <w:t xml:space="preserve">~/.config/mc/ext.d/</w:t>
+      </w:r>
+      <w:r>
+        <w:t xml:space="preserve">. Можно определить, какая программа запускается для файлов с определённым расширением.</w:t>
+      </w:r>
+    </w:p>
+    <w:bookmarkEnd w:id="146"/>
+    <w:bookmarkStart w:id="147" w:name="список-литературы"/>
+    <w:p>
+      <w:pPr>
+        <w:pStyle w:val="Heading1"/>
+      </w:pPr>
+      <w:r>
+        <w:t xml:space="preserve">Список литературы</w:t>
+      </w:r>
+    </w:p>
+    <w:p>
+      <w:pPr>
+        <w:pStyle w:val="Compact"/>
+        <w:numPr>
+          <w:ilvl w:val="0"/>
+          <w:numId w:val="1002"/>
+        </w:numPr>
+      </w:pPr>
+      <w:r>
+        <w:t xml:space="preserve">Страницы руководства</w:t>
+      </w:r>
+      <w:r>
+        <w:t xml:space="preserve"> </w:t>
+      </w:r>
+      <w:r>
+        <w:rPr>
+          <w:rStyle w:val="VerbatimChar"/>
+        </w:rPr>
+        <w:t xml:space="preserve">man mc</w:t>
+      </w:r>
+      <w:r>
+        <w:t xml:space="preserve">.</w:t>
+      </w:r>
+    </w:p>
+    <w:p>
+      <w:pPr>
+        <w:pStyle w:val="Compact"/>
+        <w:numPr>
+          <w:ilvl w:val="0"/>
+          <w:numId w:val="1002"/>
+        </w:numPr>
+      </w:pPr>
+      <w:r>
+        <w:t xml:space="preserve">Документация Midnight Commander.</w:t>
+      </w:r>
+    </w:p>
+    <w:p>
+      <w:pPr>
+        <w:pStyle w:val="Compact"/>
+        <w:numPr>
+          <w:ilvl w:val="0"/>
+          <w:numId w:val="1002"/>
+        </w:numPr>
+      </w:pPr>
+      <w:r>
+        <w:t xml:space="preserve">Курс «Архитектура компьютеров и операционные системы».</w:t>
+      </w:r>
+    </w:p>
+    <w:bookmarkEnd w:id="147"/>
     <w:sectPr/>
   </w:body>
 </w:document>
@@ -108,8 +2970,153 @@
       </w:pPr>
     </w:lvl>
   </w:abstractNum>
+  <w:abstractNum w:abstractNumId="99411">
+    <w:nsid w:val="00A99411"/>
+    <w:multiLevelType w:val="multilevel"/>
+    <w:lvl w:ilvl="0">
+      <w:start w:val="1"/>
+      <w:numFmt w:val="decimal"/>
+      <w:lvlText w:val="%1."/>
+      <w:lvlJc w:val="left"/>
+      <w:pPr>
+        <w:ind w:left="720" w:hanging="480"/>
+      </w:pPr>
+    </w:lvl>
+    <w:lvl w:ilvl="1">
+      <w:start w:val="1"/>
+      <w:numFmt w:val="decimal"/>
+      <w:lvlText w:val="%2."/>
+      <w:lvlJc w:val="left"/>
+      <w:pPr>
+        <w:ind w:left="1440" w:hanging="480"/>
+      </w:pPr>
+    </w:lvl>
+    <w:lvl w:ilvl="2">
+      <w:start w:val="1"/>
+      <w:numFmt w:val="decimal"/>
+      <w:lvlText w:val="%3."/>
+      <w:lvlJc w:val="left"/>
+      <w:pPr>
+        <w:ind w:left="2160" w:hanging="480"/>
+      </w:pPr>
+    </w:lvl>
+    <w:lvl w:ilvl="3">
+      <w:start w:val="1"/>
+      <w:numFmt w:val="decimal"/>
+      <w:lvlText w:val="%4."/>
+      <w:lvlJc w:val="left"/>
+      <w:pPr>
+        <w:ind w:left="2880" w:hanging="480"/>
+      </w:pPr>
+    </w:lvl>
+    <w:lvl w:ilvl="4">
+      <w:start w:val="1"/>
+      <w:numFmt w:val="decimal"/>
+      <w:lvlText w:val="%5."/>
+      <w:lvlJc w:val="left"/>
+      <w:pPr>
+        <w:ind w:left="3600" w:hanging="480"/>
+      </w:pPr>
+    </w:lvl>
+    <w:lvl w:ilvl="5">
+      <w:start w:val="1"/>
+      <w:numFmt w:val="decimal"/>
+      <w:lvlText w:val="%6."/>
+      <w:lvlJc w:val="left"/>
+      <w:pPr>
+        <w:ind w:left="4320" w:hanging="480"/>
+      </w:pPr>
+    </w:lvl>
+    <w:lvl w:ilvl="6">
+      <w:start w:val="1"/>
+      <w:numFmt w:val="decimal"/>
+      <w:lvlText w:val="%7."/>
+      <w:lvlJc w:val="left"/>
+      <w:pPr>
+        <w:ind w:left="5040" w:hanging="480"/>
+      </w:pPr>
+    </w:lvl>
+    <w:lvl w:ilvl="7">
+      <w:start w:val="1"/>
+      <w:numFmt w:val="decimal"/>
+      <w:lvlText w:val="%8."/>
+      <w:lvlJc w:val="left"/>
+      <w:pPr>
+        <w:ind w:left="5760" w:hanging="480"/>
+      </w:pPr>
+    </w:lvl>
+    <w:lvl w:ilvl="8">
+      <w:start w:val="1"/>
+      <w:numFmt w:val="decimal"/>
+      <w:lvlText w:val="%9."/>
+      <w:lvlJc w:val="left"/>
+      <w:pPr>
+        <w:ind w:left="6480" w:hanging="480"/>
+      </w:pPr>
+    </w:lvl>
+  </w:abstractNum>
   <w:num w:numId="1000">
     <w:abstractNumId w:val="990"/>
+  </w:num>
+  <w:num w:numId="1001">
+    <w:abstractNumId w:val="99411"/>
+    <w:lvlOverride w:ilvl="0">
+      <w:startOverride w:val="1"/>
+    </w:lvlOverride>
+    <w:lvlOverride w:ilvl="1">
+      <w:startOverride w:val="1"/>
+    </w:lvlOverride>
+    <w:lvlOverride w:ilvl="2">
+      <w:startOverride w:val="1"/>
+    </w:lvlOverride>
+    <w:lvlOverride w:ilvl="3">
+      <w:startOverride w:val="1"/>
+    </w:lvlOverride>
+    <w:lvlOverride w:ilvl="4">
+      <w:startOverride w:val="1"/>
+    </w:lvlOverride>
+    <w:lvlOverride w:ilvl="5">
+      <w:startOverride w:val="1"/>
+    </w:lvlOverride>
+    <w:lvlOverride w:ilvl="6">
+      <w:startOverride w:val="1"/>
+    </w:lvlOverride>
+    <w:lvlOverride w:ilvl="7">
+      <w:startOverride w:val="1"/>
+    </w:lvlOverride>
+    <w:lvlOverride w:ilvl="8">
+      <w:startOverride w:val="1"/>
+    </w:lvlOverride>
+  </w:num>
+  <w:num w:numId="1002">
+    <w:abstractNumId w:val="99411"/>
+    <w:lvlOverride w:ilvl="0">
+      <w:startOverride w:val="1"/>
+    </w:lvlOverride>
+    <w:lvlOverride w:ilvl="1">
+      <w:startOverride w:val="1"/>
+    </w:lvlOverride>
+    <w:lvlOverride w:ilvl="2">
+      <w:startOverride w:val="1"/>
+    </w:lvlOverride>
+    <w:lvlOverride w:ilvl="3">
+      <w:startOverride w:val="1"/>
+    </w:lvlOverride>
+    <w:lvlOverride w:ilvl="4">
+      <w:startOverride w:val="1"/>
+    </w:lvlOverride>
+    <w:lvlOverride w:ilvl="5">
+      <w:startOverride w:val="1"/>
+    </w:lvlOverride>
+    <w:lvlOverride w:ilvl="6">
+      <w:startOverride w:val="1"/>
+    </w:lvlOverride>
+    <w:lvlOverride w:ilvl="7">
+      <w:startOverride w:val="1"/>
+    </w:lvlOverride>
+    <w:lvlOverride w:ilvl="8">
+      <w:startOverride w:val="1"/>
+    </w:lvlOverride>
   </w:num>
 </w:numbering>
 </file>

</xml_diff>